<commit_message>
chore: update HCM seed data SQL file to synchronize ward data and enhance validation checks for listing distribution
</commit_message>
<xml_diff>
--- a/documents/contract-template/HomeSpace_01_Hop_Dong_Thue_Nha_Nguyen_Can.docx
+++ b/documents/contract-template/HomeSpace_01_Hop_Dong_Thue_Nha_Nguyen_Can.docx
@@ -4,1386 +4,1670 @@
   <w:body>
     <w:p>
       <w:pPr>
-        <w:keepNext w:val="0"/>
-        <w:widowControl/>
-        <w:spacing w:before="0" w:after="20" w:line="276" w:lineRule="auto"/>
-        <w:ind w:left="0" w:firstLine="0"/>
+        <w:spacing w:after="40"/>
         <w:jc w:val="center"/>
       </w:pPr>
       <w:r>
         <w:rPr>
-          <w:rFonts w:ascii="Times New Roman" w:hAnsi="Times New Roman" w:eastAsia="Times New Roman"/>
           <w:b/>
-          <w:i w:val="0"/>
-          <w:sz w:val="25"/>
+          <w:spacing w:val="-6"/>
         </w:rPr>
         <w:t>CỘNG HÒA XÃ HỘI CHỦ NGHĨA VIỆT NAM</w:t>
       </w:r>
     </w:p>
     <w:p>
       <w:pPr>
-        <w:keepNext w:val="0"/>
-        <w:widowControl/>
-        <w:spacing w:before="0" w:after="240" w:line="276" w:lineRule="auto"/>
-        <w:ind w:left="0" w:firstLine="0"/>
+        <w:spacing w:after="220"/>
         <w:jc w:val="center"/>
       </w:pPr>
       <w:r>
         <w:rPr>
-          <w:rFonts w:ascii="Times New Roman" w:hAnsi="Times New Roman" w:eastAsia="Times New Roman"/>
           <w:b/>
-          <w:i w:val="0"/>
-          <w:sz w:val="25"/>
+          <w:spacing w:val="-6"/>
         </w:rPr>
         <w:t>Độc lập - Tự do - Hạnh phúc</w:t>
       </w:r>
     </w:p>
     <w:p>
       <w:pPr>
-        <w:keepNext w:val="0"/>
-        <w:widowControl/>
-        <w:spacing w:before="0" w:after="60" w:line="276" w:lineRule="auto"/>
-        <w:ind w:left="0" w:firstLine="0"/>
-        <w:jc w:val="center"/>
+        <w:pStyle w:val="ContractTitle"/>
       </w:pPr>
       <w:r>
         <w:rPr>
-          <w:rFonts w:ascii="Times New Roman" w:hAnsi="Times New Roman" w:eastAsia="Times New Roman"/>
-          <w:b/>
-          <w:i w:val="0"/>
-          <w:sz w:val="32"/>
+          <w:b w:val="0"/>
         </w:rPr>
         <w:t>HỢP ĐỒNG THUÊ NHÀ NGUYÊN CĂN</w:t>
       </w:r>
     </w:p>
     <w:p>
       <w:pPr>
-        <w:keepNext w:val="0"/>
-        <w:widowControl/>
-        <w:spacing w:before="0" w:after="160" w:line="276" w:lineRule="auto"/>
-        <w:ind w:left="0" w:firstLine="0"/>
+        <w:spacing w:after="260"/>
         <w:jc w:val="center"/>
       </w:pPr>
       <w:r>
         <w:rPr>
-          <w:rFonts w:ascii="Times New Roman" w:hAnsi="Times New Roman" w:eastAsia="Times New Roman"/>
           <w:b w:val="0"/>
-          <w:i w:val="0"/>
           <w:sz w:val="23"/>
+          <w:spacing w:val="-6"/>
         </w:rPr>
-        <w:t>Số: {{contract.number}} - Ngày ký: {{contract.signingDate}} tại {{contract.signingCity}}.</w:t>
+        <w:t xml:space="preserve">Số: </w:t>
+      </w:r>
+      <w:r>
+        <w:rPr>
+          <w:b w:val="0"/>
+          <w:sz w:val="23"/>
+          <w:spacing w:val="-6"/>
+        </w:rPr>
+        <w:t>{{contract.number}}</w:t>
+      </w:r>
+      <w:r>
+        <w:rPr>
+          <w:b w:val="0"/>
+          <w:sz w:val="23"/>
+          <w:spacing w:val="-6"/>
+        </w:rPr>
+        <w:t xml:space="preserve"> - Ngày ký: </w:t>
+      </w:r>
+      <w:r>
+        <w:rPr>
+          <w:b w:val="0"/>
+          <w:sz w:val="23"/>
+          <w:spacing w:val="-6"/>
+        </w:rPr>
+        <w:t>{{contract.signingDate}}</w:t>
+      </w:r>
+      <w:r>
+        <w:rPr>
+          <w:b w:val="0"/>
+          <w:sz w:val="23"/>
+          <w:spacing w:val="-6"/>
+        </w:rPr>
+        <w:t xml:space="preserve"> tại </w:t>
+      </w:r>
+      <w:r>
+        <w:rPr>
+          <w:b w:val="0"/>
+          <w:sz w:val="23"/>
+          <w:spacing w:val="-6"/>
+        </w:rPr>
+        <w:t>{{contract.signingCity}}</w:t>
+      </w:r>
+      <w:r>
+        <w:rPr>
+          <w:b w:val="0"/>
+          <w:sz w:val="23"/>
+          <w:spacing w:val="-6"/>
+        </w:rPr>
+        <w:t>.</w:t>
       </w:r>
     </w:p>
     <w:p>
       <w:pPr>
-        <w:keepNext/>
-        <w:widowControl/>
-        <w:spacing w:before="160" w:after="80" w:line="276" w:lineRule="auto"/>
-        <w:ind w:left="0" w:firstLine="0"/>
-        <w:jc w:val="left"/>
+        <w:pStyle w:val="ContractLegalHeading"/>
       </w:pPr>
       <w:r>
         <w:rPr>
-          <w:rFonts w:ascii="Times New Roman" w:hAnsi="Times New Roman" w:eastAsia="Times New Roman"/>
-          <w:b/>
-          <w:i w:val="0"/>
-          <w:sz w:val="26"/>
+          <w:b w:val="0"/>
         </w:rPr>
         <w:t>CĂN CỨ PHÁP LÝ</w:t>
       </w:r>
     </w:p>
     <w:p>
       <w:pPr>
-        <w:keepNext w:val="0"/>
-        <w:widowControl/>
-        <w:spacing w:before="0" w:after="60" w:line="276" w:lineRule="auto"/>
-        <w:ind w:left="227" w:hanging="170"/>
-        <w:jc w:val="both"/>
+        <w:spacing w:after="40"/>
+        <w:ind w:left="272" w:hanging="215"/>
       </w:pPr>
       <w:r>
         <w:rPr>
-          <w:rFonts w:ascii="Times New Roman" w:hAnsi="Times New Roman" w:eastAsia="Times New Roman"/>
           <w:b w:val="0"/>
-          <w:i w:val="0"/>
-          <w:sz w:val="24"/>
+          <w:spacing w:val="-6"/>
         </w:rPr>
         <w:t>• Bộ luật Dân sự số 91/2015/QH13;</w:t>
       </w:r>
     </w:p>
     <w:p>
       <w:pPr>
-        <w:keepNext w:val="0"/>
-        <w:widowControl/>
-        <w:spacing w:before="0" w:after="60" w:line="276" w:lineRule="auto"/>
-        <w:ind w:left="227" w:hanging="170"/>
-        <w:jc w:val="both"/>
+        <w:spacing w:after="40"/>
+        <w:ind w:left="272" w:hanging="215"/>
       </w:pPr>
       <w:r>
         <w:rPr>
-          <w:rFonts w:ascii="Times New Roman" w:hAnsi="Times New Roman" w:eastAsia="Times New Roman"/>
           <w:b w:val="0"/>
-          <w:i w:val="0"/>
-          <w:sz w:val="24"/>
+          <w:spacing w:val="-6"/>
         </w:rPr>
         <w:t>• Luật Nhà ở số 27/2023/QH15;</w:t>
       </w:r>
     </w:p>
     <w:p>
       <w:pPr>
-        <w:keepNext w:val="0"/>
-        <w:widowControl/>
-        <w:spacing w:before="0" w:after="60" w:line="276" w:lineRule="auto"/>
-        <w:ind w:left="227" w:hanging="170"/>
-        <w:jc w:val="both"/>
+        <w:spacing w:after="40"/>
+        <w:ind w:left="272" w:hanging="215"/>
       </w:pPr>
       <w:r>
         <w:rPr>
-          <w:rFonts w:ascii="Times New Roman" w:hAnsi="Times New Roman" w:eastAsia="Times New Roman"/>
           <w:b w:val="0"/>
-          <w:i w:val="0"/>
-          <w:sz w:val="24"/>
+          <w:spacing w:val="-6"/>
         </w:rPr>
         <w:t>• Luật Giao dịch điện tử số 20/2023/QH15;</w:t>
       </w:r>
     </w:p>
     <w:p>
       <w:pPr>
-        <w:keepNext w:val="0"/>
-        <w:widowControl/>
-        <w:spacing w:before="0" w:after="60" w:line="276" w:lineRule="auto"/>
-        <w:ind w:left="227" w:hanging="170"/>
-        <w:jc w:val="both"/>
+        <w:spacing w:after="40"/>
+        <w:ind w:left="272" w:hanging="215"/>
       </w:pPr>
       <w:r>
         <w:rPr>
-          <w:rFonts w:ascii="Times New Roman" w:hAnsi="Times New Roman" w:eastAsia="Times New Roman"/>
           <w:b w:val="0"/>
-          <w:i w:val="0"/>
-          <w:sz w:val="24"/>
+          <w:spacing w:val="-6"/>
         </w:rPr>
         <w:t>• Luật Cư trú số 68/2020/QH14;</w:t>
       </w:r>
     </w:p>
     <w:p>
       <w:pPr>
-        <w:keepNext w:val="0"/>
-        <w:widowControl/>
-        <w:spacing w:before="0" w:after="60" w:line="276" w:lineRule="auto"/>
-        <w:ind w:left="227" w:hanging="170"/>
-        <w:jc w:val="both"/>
+        <w:spacing w:after="40"/>
+        <w:ind w:left="272" w:hanging="215"/>
       </w:pPr>
       <w:r>
         <w:rPr>
-          <w:rFonts w:ascii="Times New Roman" w:hAnsi="Times New Roman" w:eastAsia="Times New Roman"/>
           <w:b w:val="0"/>
-          <w:i w:val="0"/>
-          <w:sz w:val="24"/>
+          <w:spacing w:val="-6"/>
         </w:rPr>
         <w:t>• Luật Phòng cháy, chữa cháy và cứu nạn, cứu hộ số 55/2024/QH15;</w:t>
       </w:r>
     </w:p>
     <w:p>
       <w:pPr>
-        <w:keepNext w:val="0"/>
-        <w:widowControl/>
-        <w:spacing w:before="0" w:after="60" w:line="276" w:lineRule="auto"/>
-        <w:ind w:left="227" w:hanging="170"/>
-        <w:jc w:val="both"/>
+        <w:spacing w:after="40"/>
+        <w:ind w:left="272" w:hanging="215"/>
       </w:pPr>
       <w:r>
         <w:rPr>
-          <w:rFonts w:ascii="Times New Roman" w:hAnsi="Times New Roman" w:eastAsia="Times New Roman"/>
           <w:b w:val="0"/>
-          <w:i w:val="0"/>
-          <w:sz w:val="24"/>
+          <w:spacing w:val="-6"/>
         </w:rPr>
         <w:t>• Luật Kinh doanh bất động sản số 29/2023/QH15 (trong phạm vi áp dụng).</w:t>
       </w:r>
     </w:p>
     <w:p>
       <w:pPr>
-        <w:keepNext/>
-        <w:widowControl/>
-        <w:spacing w:before="160" w:after="80" w:line="276" w:lineRule="auto"/>
-        <w:ind w:left="0" w:firstLine="0"/>
-        <w:jc w:val="left"/>
+        <w:pStyle w:val="ContractLegalHeading"/>
       </w:pPr>
       <w:r>
         <w:rPr>
-          <w:rFonts w:ascii="Times New Roman" w:hAnsi="Times New Roman" w:eastAsia="Times New Roman"/>
-          <w:b/>
-          <w:i w:val="0"/>
-          <w:sz w:val="26"/>
+          <w:b w:val="0"/>
         </w:rPr>
         <w:t>THÔNG TIN CÁC BÊN</w:t>
       </w:r>
     </w:p>
     <w:p>
-      <w:pPr>
-        <w:keepNext w:val="0"/>
-        <w:widowControl/>
-        <w:spacing w:before="0" w:after="40" w:line="276" w:lineRule="auto"/>
-        <w:ind w:left="0" w:firstLine="0"/>
-        <w:jc w:val="left"/>
-      </w:pPr>
+      <w:pPr/>
       <w:r>
         <w:rPr>
-          <w:rFonts w:ascii="Times New Roman" w:hAnsi="Times New Roman" w:eastAsia="Times New Roman"/>
           <w:b/>
-          <w:i w:val="0"/>
-          <w:sz w:val="24"/>
+          <w:spacing w:val="-6"/>
         </w:rPr>
         <w:t xml:space="preserve">BÊN CHO THUÊ (BÊN A): </w:t>
       </w:r>
       <w:r>
         <w:rPr>
-          <w:rFonts w:ascii="Times New Roman" w:hAnsi="Times New Roman" w:eastAsia="Times New Roman"/>
           <w:b w:val="0"/>
-          <w:i w:val="0"/>
-          <w:sz w:val="24"/>
+          <w:spacing w:val="-6"/>
         </w:rPr>
         <w:t>{{landlord.fullName}}</w:t>
       </w:r>
     </w:p>
     <w:p>
-      <w:pPr>
-        <w:keepNext w:val="0"/>
-        <w:widowControl/>
-        <w:spacing w:before="0" w:after="80" w:line="276" w:lineRule="auto"/>
-        <w:ind w:left="0" w:firstLine="0"/>
-        <w:jc w:val="left"/>
-      </w:pPr>
+      <w:pPr/>
       <w:r>
         <w:rPr>
-          <w:rFonts w:ascii="Times New Roman" w:hAnsi="Times New Roman" w:eastAsia="Times New Roman"/>
           <w:b w:val="0"/>
-          <w:i w:val="0"/>
-          <w:sz w:val="24"/>
+          <w:spacing w:val="-6"/>
         </w:rPr>
-        <w:t>CCCD/Hộ chiếu: {{landlord.idNumber}}; Thường trú: {{landlord.permanentAddress}}.</w:t>
+        <w:t xml:space="preserve">CCCD/Hộ chiếu: </w:t>
+      </w:r>
+      <w:r>
+        <w:rPr>
+          <w:b w:val="0"/>
+          <w:spacing w:val="-6"/>
+        </w:rPr>
+        <w:t>{{landlord.idNumber}}</w:t>
+      </w:r>
+      <w:r>
+        <w:rPr>
+          <w:b w:val="0"/>
+          <w:spacing w:val="-6"/>
+        </w:rPr>
+        <w:t xml:space="preserve">; Thường trú: </w:t>
+      </w:r>
+      <w:r>
+        <w:rPr>
+          <w:b w:val="0"/>
+          <w:spacing w:val="-6"/>
+        </w:rPr>
+        <w:t>{{landlord.permanentAddress}}</w:t>
+      </w:r>
+      <w:r>
+        <w:rPr>
+          <w:b w:val="0"/>
+          <w:spacing w:val="-6"/>
+        </w:rPr>
+        <w:t>.</w:t>
       </w:r>
     </w:p>
     <w:p>
-      <w:pPr>
-        <w:keepNext w:val="0"/>
-        <w:widowControl/>
-        <w:spacing w:before="0" w:after="80" w:line="276" w:lineRule="auto"/>
-        <w:ind w:left="0" w:firstLine="0"/>
-        <w:jc w:val="left"/>
-      </w:pPr>
+      <w:pPr/>
       <w:r>
         <w:rPr>
-          <w:rFonts w:ascii="Times New Roman" w:hAnsi="Times New Roman" w:eastAsia="Times New Roman"/>
           <w:b w:val="0"/>
-          <w:i w:val="0"/>
-          <w:sz w:val="24"/>
+          <w:spacing w:val="-6"/>
         </w:rPr>
-        <w:t>Điện thoại: {{landlord.phone}}; Email: {{landlord.email}}.</w:t>
+        <w:t xml:space="preserve">Điện thoại: </w:t>
+      </w:r>
+      <w:r>
+        <w:rPr>
+          <w:b w:val="0"/>
+          <w:spacing w:val="-6"/>
+        </w:rPr>
+        <w:t>{{landlord.phone}}</w:t>
+      </w:r>
+      <w:r>
+        <w:rPr>
+          <w:b w:val="0"/>
+          <w:spacing w:val="-6"/>
+        </w:rPr>
+        <w:t xml:space="preserve">; Email: </w:t>
+      </w:r>
+      <w:r>
+        <w:rPr>
+          <w:b w:val="0"/>
+          <w:spacing w:val="-6"/>
+        </w:rPr>
+        <w:t>{{landlord.email}}</w:t>
+      </w:r>
+      <w:r>
+        <w:rPr>
+          <w:b w:val="0"/>
+          <w:spacing w:val="-6"/>
+        </w:rPr>
+        <w:t>.</w:t>
       </w:r>
     </w:p>
     <w:p>
-      <w:pPr>
-        <w:keepNext w:val="0"/>
-        <w:widowControl/>
-        <w:spacing w:before="0" w:after="80" w:line="276" w:lineRule="auto"/>
-        <w:ind w:left="0" w:firstLine="0"/>
-        <w:jc w:val="left"/>
-      </w:pPr>
+      <w:pPr/>
       <w:r>
         <w:rPr>
-          <w:rFonts w:ascii="Times New Roman" w:hAnsi="Times New Roman" w:eastAsia="Times New Roman"/>
           <w:b w:val="0"/>
-          <w:i w:val="0"/>
-          <w:sz w:val="24"/>
+          <w:spacing w:val="-6"/>
         </w:rPr>
-        <w:t>Tài khoản nhận thanh toán: Chủ tài khoản: {{landlord.bankAccountHolder}} - Số tài khoản: {{landlord.bankAccountNumber}} - Ngân hàng: {{landlord.bankName}}.</w:t>
+        <w:t xml:space="preserve">Tài khoản nhận thanh toán: Chủ tài khoản: </w:t>
+      </w:r>
+      <w:r>
+        <w:rPr>
+          <w:b w:val="0"/>
+          <w:spacing w:val="-6"/>
+        </w:rPr>
+        <w:t>{{landlord.bankAccountHolder}}</w:t>
+      </w:r>
+      <w:r>
+        <w:rPr>
+          <w:b w:val="0"/>
+          <w:spacing w:val="-6"/>
+        </w:rPr>
+        <w:t xml:space="preserve"> - Số tài khoản: </w:t>
+      </w:r>
+      <w:r>
+        <w:rPr>
+          <w:b w:val="0"/>
+          <w:spacing w:val="-6"/>
+        </w:rPr>
+        <w:t>{{landlord.bankAccountNumber}}</w:t>
+      </w:r>
+      <w:r>
+        <w:rPr>
+          <w:b w:val="0"/>
+          <w:spacing w:val="-6"/>
+        </w:rPr>
+        <w:t xml:space="preserve"> - Ngân hàng: </w:t>
+      </w:r>
+      <w:r>
+        <w:rPr>
+          <w:b w:val="0"/>
+          <w:spacing w:val="-6"/>
+        </w:rPr>
+        <w:t>{{landlord.bankName}}</w:t>
+      </w:r>
+      <w:r>
+        <w:rPr>
+          <w:b w:val="0"/>
+          <w:spacing w:val="-6"/>
+        </w:rPr>
+        <w:t>.</w:t>
       </w:r>
     </w:p>
     <w:p>
-      <w:pPr>
-        <w:keepNext w:val="0"/>
-        <w:widowControl/>
-        <w:spacing w:before="60" w:after="40" w:line="276" w:lineRule="auto"/>
-        <w:ind w:left="0" w:firstLine="0"/>
-        <w:jc w:val="left"/>
-      </w:pPr>
+      <w:pPr/>
       <w:r>
         <w:rPr>
-          <w:rFonts w:ascii="Times New Roman" w:hAnsi="Times New Roman" w:eastAsia="Times New Roman"/>
           <w:b/>
-          <w:i w:val="0"/>
-          <w:sz w:val="24"/>
+          <w:spacing w:val="-6"/>
         </w:rPr>
         <w:t xml:space="preserve">BÊN THUÊ (BÊN B): </w:t>
       </w:r>
       <w:r>
         <w:rPr>
-          <w:rFonts w:ascii="Times New Roman" w:hAnsi="Times New Roman" w:eastAsia="Times New Roman"/>
           <w:b w:val="0"/>
-          <w:i w:val="0"/>
-          <w:sz w:val="24"/>
+          <w:spacing w:val="-6"/>
         </w:rPr>
         <w:t>{{tenant.fullName}}</w:t>
       </w:r>
     </w:p>
     <w:p>
-      <w:pPr>
-        <w:keepNext w:val="0"/>
-        <w:widowControl/>
-        <w:spacing w:before="0" w:after="80" w:line="276" w:lineRule="auto"/>
-        <w:ind w:left="0" w:firstLine="0"/>
-        <w:jc w:val="left"/>
-      </w:pPr>
+      <w:pPr/>
       <w:r>
         <w:rPr>
-          <w:rFonts w:ascii="Times New Roman" w:hAnsi="Times New Roman" w:eastAsia="Times New Roman"/>
           <w:b w:val="0"/>
-          <w:i w:val="0"/>
-          <w:sz w:val="24"/>
+          <w:spacing w:val="-6"/>
         </w:rPr>
-        <w:t>CCCD/Hộ chiếu: {{tenant.idNumber}}; Thường trú: {{tenant.permanentAddress}}.</w:t>
+        <w:t xml:space="preserve">CCCD/Hộ chiếu: </w:t>
+      </w:r>
+      <w:r>
+        <w:rPr>
+          <w:b w:val="0"/>
+          <w:spacing w:val="-6"/>
+        </w:rPr>
+        <w:t>{{tenant.idNumber}}</w:t>
+      </w:r>
+      <w:r>
+        <w:rPr>
+          <w:b w:val="0"/>
+          <w:spacing w:val="-6"/>
+        </w:rPr>
+        <w:t xml:space="preserve">; Thường trú: </w:t>
+      </w:r>
+      <w:r>
+        <w:rPr>
+          <w:b w:val="0"/>
+          <w:spacing w:val="-6"/>
+        </w:rPr>
+        <w:t>{{tenant.permanentAddress}}</w:t>
+      </w:r>
+      <w:r>
+        <w:rPr>
+          <w:b w:val="0"/>
+          <w:spacing w:val="-6"/>
+        </w:rPr>
+        <w:t>.</w:t>
+      </w:r>
+    </w:p>
+    <w:p>
+      <w:pPr/>
+      <w:r>
+        <w:rPr>
+          <w:b w:val="0"/>
+          <w:spacing w:val="-6"/>
+        </w:rPr>
+        <w:t xml:space="preserve">Điện thoại: </w:t>
+      </w:r>
+      <w:r>
+        <w:rPr>
+          <w:b w:val="0"/>
+          <w:spacing w:val="-6"/>
+        </w:rPr>
+        <w:t>{{tenant.phone}}</w:t>
+      </w:r>
+      <w:r>
+        <w:rPr>
+          <w:b w:val="0"/>
+          <w:spacing w:val="-6"/>
+        </w:rPr>
+        <w:t xml:space="preserve">; Email: </w:t>
+      </w:r>
+      <w:r>
+        <w:rPr>
+          <w:b w:val="0"/>
+          <w:spacing w:val="-6"/>
+        </w:rPr>
+        <w:t>{{tenant.email}}</w:t>
+      </w:r>
+      <w:r>
+        <w:rPr>
+          <w:b w:val="0"/>
+          <w:spacing w:val="-6"/>
+        </w:rPr>
+        <w:t>.</w:t>
+      </w:r>
+    </w:p>
+    <w:p>
+      <w:pPr/>
+      <w:r>
+        <w:rPr>
+          <w:b w:val="0"/>
+          <w:spacing w:val="-6"/>
+        </w:rPr>
+        <w:t xml:space="preserve">Số người ở: </w:t>
+      </w:r>
+      <w:r>
+        <w:rPr>
+          <w:b w:val="0"/>
+          <w:spacing w:val="-6"/>
+        </w:rPr>
+        <w:t>{{tenant.occupantCount}}</w:t>
+      </w:r>
+      <w:r>
+        <w:rPr>
+          <w:b w:val="0"/>
+          <w:spacing w:val="-6"/>
+        </w:rPr>
+        <w:t xml:space="preserve">; Xe máy: </w:t>
+      </w:r>
+      <w:r>
+        <w:rPr>
+          <w:b w:val="0"/>
+          <w:spacing w:val="-6"/>
+        </w:rPr>
+        <w:t>{{tenant.motorbikeCount}}</w:t>
+      </w:r>
+      <w:r>
+        <w:rPr>
+          <w:b w:val="0"/>
+          <w:spacing w:val="-6"/>
+        </w:rPr>
+        <w:t xml:space="preserve">; Ô tô: </w:t>
+      </w:r>
+      <w:r>
+        <w:rPr>
+          <w:b w:val="0"/>
+          <w:spacing w:val="-6"/>
+        </w:rPr>
+        <w:t>{{tenant.carCount}}</w:t>
+      </w:r>
+      <w:r>
+        <w:rPr>
+          <w:b w:val="0"/>
+          <w:spacing w:val="-6"/>
+        </w:rPr>
+        <w:t>.</w:t>
+      </w:r>
+    </w:p>
+    <w:p>
+      <w:pPr/>
+      <w:r>
+        <w:rPr>
+          <w:b w:val="0"/>
+          <w:spacing w:val="-6"/>
+        </w:rPr>
+        <w:t xml:space="preserve">Tài khoản nhận hoàn trả: Chủ tài khoản: </w:t>
+      </w:r>
+      <w:r>
+        <w:rPr>
+          <w:b w:val="0"/>
+          <w:spacing w:val="-6"/>
+        </w:rPr>
+        <w:t>{{tenant.bankAccountHolder}}</w:t>
+      </w:r>
+      <w:r>
+        <w:rPr>
+          <w:b w:val="0"/>
+          <w:spacing w:val="-6"/>
+        </w:rPr>
+        <w:t xml:space="preserve"> - Số tài khoản: </w:t>
+      </w:r>
+      <w:r>
+        <w:rPr>
+          <w:b w:val="0"/>
+          <w:spacing w:val="-6"/>
+        </w:rPr>
+        <w:t>{{tenant.bankAccountNumber}}</w:t>
+      </w:r>
+      <w:r>
+        <w:rPr>
+          <w:b w:val="0"/>
+          <w:spacing w:val="-6"/>
+        </w:rPr>
+        <w:t xml:space="preserve"> - Ngân hàng: </w:t>
+      </w:r>
+      <w:r>
+        <w:rPr>
+          <w:b w:val="0"/>
+          <w:spacing w:val="-6"/>
+        </w:rPr>
+        <w:t>{{tenant.bankName}}</w:t>
+      </w:r>
+      <w:r>
+        <w:rPr>
+          <w:b w:val="0"/>
+          <w:spacing w:val="-6"/>
+        </w:rPr>
+        <w:t>.</w:t>
       </w:r>
     </w:p>
     <w:p>
       <w:pPr>
-        <w:keepNext w:val="0"/>
-        <w:widowControl/>
-        <w:spacing w:before="0" w:after="80" w:line="276" w:lineRule="auto"/>
-        <w:ind w:left="0" w:firstLine="0"/>
-        <w:jc w:val="left"/>
+        <w:pStyle w:val="ContractHeading"/>
       </w:pPr>
       <w:r>
         <w:rPr>
-          <w:rFonts w:ascii="Times New Roman" w:hAnsi="Times New Roman" w:eastAsia="Times New Roman"/>
           <w:b w:val="0"/>
-          <w:i w:val="0"/>
-          <w:sz w:val="24"/>
-        </w:rPr>
-        <w:t>Điện thoại: {{tenant.phone}}; Email: {{tenant.email}}.</w:t>
-      </w:r>
-    </w:p>
-    <w:p>
-      <w:pPr>
-        <w:keepNext w:val="0"/>
-        <w:widowControl/>
-        <w:spacing w:before="0" w:after="80" w:line="276" w:lineRule="auto"/>
-        <w:ind w:left="0" w:firstLine="0"/>
-        <w:jc w:val="left"/>
-      </w:pPr>
-      <w:r>
-        <w:rPr>
-          <w:rFonts w:ascii="Times New Roman" w:hAnsi="Times New Roman" w:eastAsia="Times New Roman"/>
-          <w:b w:val="0"/>
-          <w:i w:val="0"/>
-          <w:sz w:val="24"/>
-        </w:rPr>
-        <w:t>Số người cư trú: {{tenant.occupantCount}}; Xe máy đăng ký: {{tenant.motorbikeCount}}; Ô tô đăng ký: {{tenant.carCount}}.</w:t>
-      </w:r>
-    </w:p>
-    <w:p>
-      <w:pPr>
-        <w:keepNext w:val="0"/>
-        <w:widowControl/>
-        <w:spacing w:before="0" w:after="80" w:line="276" w:lineRule="auto"/>
-        <w:ind w:left="0" w:firstLine="0"/>
-        <w:jc w:val="left"/>
-      </w:pPr>
-      <w:r>
-        <w:rPr>
-          <w:rFonts w:ascii="Times New Roman" w:hAnsi="Times New Roman" w:eastAsia="Times New Roman"/>
-          <w:b w:val="0"/>
-          <w:i w:val="0"/>
-          <w:sz w:val="24"/>
-        </w:rPr>
-        <w:t>Tài khoản nhận hoàn trả: Chủ tài khoản: {{tenant.bankAccountHolder}} - Số tài khoản: {{tenant.bankAccountNumber}} - Ngân hàng: {{tenant.bankName}}.</w:t>
-      </w:r>
-    </w:p>
-    <w:p>
-      <w:pPr>
-        <w:keepNext/>
-        <w:widowControl/>
-        <w:spacing w:before="160" w:after="80" w:line="276" w:lineRule="auto"/>
-        <w:ind w:left="0" w:firstLine="0"/>
-        <w:jc w:val="left"/>
-      </w:pPr>
-      <w:r>
-        <w:rPr>
-          <w:rFonts w:ascii="Times New Roman" w:hAnsi="Times New Roman" w:eastAsia="Times New Roman"/>
-          <w:b/>
-          <w:i w:val="0"/>
-          <w:sz w:val="26"/>
         </w:rPr>
         <w:t>ĐIỀU 1. ĐỐI TƯỢNG VÀ PHẠM VI CHO THUÊ</w:t>
       </w:r>
     </w:p>
     <w:p>
-      <w:pPr>
-        <w:keepNext w:val="0"/>
-        <w:widowControl/>
-        <w:spacing w:before="0" w:after="80" w:line="276" w:lineRule="auto"/>
-        <w:ind w:left="0" w:firstLine="0"/>
-        <w:jc w:val="both"/>
-      </w:pPr>
+      <w:pPr/>
       <w:r>
         <w:rPr>
-          <w:rFonts w:ascii="Times New Roman" w:hAnsi="Times New Roman" w:eastAsia="Times New Roman"/>
           <w:b w:val="0"/>
-          <w:i w:val="0"/>
-          <w:sz w:val="24"/>
+          <w:spacing w:val="-6"/>
         </w:rPr>
-        <w:t>1.1. Bên A đồng ý cho Bên B thuê toàn bộ căn nhà tại địa chỉ: {{property.fullAddress}}.</w:t>
+        <w:t xml:space="preserve">1.1. Bên A đồng ý cho Bên B thuê toàn bộ căn nhà tại địa chỉ: </w:t>
+      </w:r>
+      <w:r>
+        <w:rPr>
+          <w:b w:val="0"/>
+          <w:spacing w:val="-6"/>
+        </w:rPr>
+        <w:t>{{property.fullAddress}}</w:t>
+      </w:r>
+      <w:r>
+        <w:rPr>
+          <w:b w:val="0"/>
+          <w:spacing w:val="-6"/>
+        </w:rPr>
+        <w:t>.</w:t>
+      </w:r>
+    </w:p>
+    <w:p>
+      <w:pPr/>
+      <w:r>
+        <w:rPr>
+          <w:b w:val="0"/>
+          <w:spacing w:val="-6"/>
+        </w:rPr>
+        <w:t xml:space="preserve">1.2. Diện tích: </w:t>
+      </w:r>
+      <w:r>
+        <w:rPr>
+          <w:b w:val="0"/>
+          <w:spacing w:val="-6"/>
+        </w:rPr>
+        <w:t>{{property.areaText}}</w:t>
+      </w:r>
+      <w:r>
+        <w:rPr>
+          <w:b w:val="0"/>
+          <w:spacing w:val="-6"/>
+        </w:rPr>
+        <w:t xml:space="preserve">; Kết cấu/Số tầng: </w:t>
+      </w:r>
+      <w:r>
+        <w:rPr>
+          <w:b w:val="0"/>
+          <w:spacing w:val="-6"/>
+        </w:rPr>
+        <w:t>{{property.floor}}</w:t>
+      </w:r>
+      <w:r>
+        <w:rPr>
+          <w:b w:val="0"/>
+          <w:spacing w:val="-6"/>
+        </w:rPr>
+        <w:t xml:space="preserve">; Phạm vi thuê: </w:t>
+      </w:r>
+      <w:r>
+        <w:rPr>
+          <w:b w:val="0"/>
+          <w:spacing w:val="-6"/>
+        </w:rPr>
+        <w:t>{{property.rentalScope}}</w:t>
+      </w:r>
+      <w:r>
+        <w:rPr>
+          <w:b w:val="0"/>
+          <w:spacing w:val="-6"/>
+        </w:rPr>
+        <w:t xml:space="preserve">; Mã tin: </w:t>
+      </w:r>
+      <w:r>
+        <w:rPr>
+          <w:b w:val="0"/>
+          <w:spacing w:val="-6"/>
+        </w:rPr>
+        <w:t>{{property.listingCode}}</w:t>
+      </w:r>
+      <w:r>
+        <w:rPr>
+          <w:b w:val="0"/>
+          <w:spacing w:val="-6"/>
+        </w:rPr>
+        <w:t>.</w:t>
+      </w:r>
+      <w:r>
+        <w:rPr>
+          <w:spacing w:val="-6"/>
+        </w:rPr>
+        <w:t xml:space="preserve"> Loại hình bất động sản: </w:t>
+      </w:r>
+      <w:r>
+        <w:rPr>
+          <w:spacing w:val="-6"/>
+        </w:rPr>
+        <w:t>{{property.propertyType}}</w:t>
+      </w:r>
+      <w:r>
+        <w:rPr>
+          <w:spacing w:val="-6"/>
+        </w:rPr>
+        <w:t>.</w:t>
+      </w:r>
+    </w:p>
+    <w:p>
+      <w:pPr/>
+      <w:r>
+        <w:rPr>
+          <w:b w:val="0"/>
+          <w:spacing w:val="-6"/>
+        </w:rPr>
+        <w:t>1.3. Bảng thông số đặc điểm căn nhà:</w:t>
       </w:r>
     </w:p>
     <w:p>
       <w:pPr>
-        <w:keepNext w:val="0"/>
-        <w:widowControl/>
-        <w:spacing w:before="0" w:after="80" w:line="276" w:lineRule="auto"/>
-        <w:ind w:left="0" w:firstLine="0"/>
-        <w:jc w:val="both"/>
-      </w:pPr>
-      <w:r>
-        <w:rPr>
-          <w:rFonts w:ascii="Times New Roman" w:hAnsi="Times New Roman" w:eastAsia="Times New Roman"/>
-          <w:b w:val="0"/>
-          <w:i w:val="0"/>
-          <w:sz w:val="24"/>
-        </w:rPr>
-        <w:t>1.2. Diện tích: {{property.areaText}}; Kết cấu/Số tầng: {{property.floor}}; Loại tài sản: {{property.propertyType}}; Phạm vi thuê: {{property.rentalScope}}; Mã tin: {{property.listingCode}}.</w:t>
-      </w:r>
-    </w:p>
-    <w:p>
-      <w:pPr>
-        <w:keepNext w:val="0"/>
-        <w:widowControl/>
-        <w:spacing w:before="0" w:after="80" w:line="276" w:lineRule="auto"/>
-        <w:ind w:left="0" w:firstLine="0"/>
-        <w:jc w:val="both"/>
-      </w:pPr>
-      <w:r>
-        <w:rPr>
-          <w:rFonts w:ascii="Times New Roman" w:hAnsi="Times New Roman" w:eastAsia="Times New Roman"/>
-          <w:b w:val="0"/>
-          <w:i w:val="0"/>
-          <w:sz w:val="24"/>
-        </w:rPr>
-        <w:t>1.3. Số người tối đa cho phép: {{property.maxOccupants}}; Số xe tối đa cho phép: {{property.maxVehicles}}.</w:t>
-      </w:r>
-    </w:p>
-    <w:p>
-      <w:pPr>
-        <w:keepNext/>
-        <w:widowControl/>
-        <w:spacing w:before="0" w:after="80" w:line="276" w:lineRule="auto"/>
-        <w:ind w:left="0" w:firstLine="0"/>
-        <w:jc w:val="both"/>
-      </w:pPr>
-      <w:r>
-        <w:rPr>
-          <w:rFonts w:ascii="Times New Roman" w:hAnsi="Times New Roman" w:eastAsia="Times New Roman"/>
-          <w:b w:val="0"/>
-          <w:i w:val="0"/>
-          <w:sz w:val="24"/>
-        </w:rPr>
-        <w:t>1.4. Bảng thông số đặc điểm căn nhà:</w:t>
-      </w:r>
-    </w:p>
-    <w:p>
-      <w:pPr>
-        <w:keepNext w:val="0"/>
-        <w:widowControl/>
-        <w:spacing w:before="20" w:after="100" w:line="276" w:lineRule="auto"/>
-        <w:ind w:left="0" w:firstLine="0"/>
+        <w:pStyle w:val="ContractMarker"/>
+        <w:spacing w:after="80"/>
         <w:jc w:val="left"/>
       </w:pPr>
       <w:r>
         <w:rPr>
-          <w:rFonts w:ascii="Times New Roman" w:hAnsi="Times New Roman" w:eastAsia="Times New Roman"/>
           <w:b w:val="0"/>
-          <w:i w:val="0"/>
-          <w:sz w:val="24"/>
+          <w:spacing w:val="-6"/>
         </w:rPr>
         <w:t>{{#propertyFeaturesTable}}</w:t>
       </w:r>
     </w:p>
     <w:p>
-      <w:pPr>
-        <w:keepNext w:val="0"/>
-        <w:widowControl/>
-        <w:spacing w:before="0" w:after="80" w:line="276" w:lineRule="auto"/>
-        <w:ind w:left="0" w:firstLine="0"/>
-        <w:jc w:val="both"/>
-      </w:pPr>
+      <w:pPr/>
       <w:r>
         <w:rPr>
-          <w:rFonts w:ascii="Times New Roman" w:hAnsi="Times New Roman" w:eastAsia="Times New Roman"/>
           <w:b w:val="0"/>
-          <w:i w:val="0"/>
-          <w:sz w:val="24"/>
+          <w:spacing w:val="-6"/>
         </w:rPr>
-        <w:t>1.5. Mục đích thuê: Dùng để ở và sinh hoạt hợp pháp, không sử dụng vào mục đích vi phạm pháp luật.</w:t>
+        <w:t>1.4. Mục đích thuê: Dùng để ở và sinh hoạt hợp pháp, không sử dụng vào mục đích vi phạm pháp luật.</w:t>
       </w:r>
     </w:p>
     <w:p>
       <w:pPr>
-        <w:keepNext/>
-        <w:widowControl/>
-        <w:spacing w:before="160" w:after="80" w:line="276" w:lineRule="auto"/>
-        <w:ind w:left="0" w:firstLine="0"/>
-        <w:jc w:val="left"/>
+        <w:pStyle w:val="ContractHeading"/>
       </w:pPr>
       <w:r>
         <w:rPr>
-          <w:rFonts w:ascii="Times New Roman" w:hAnsi="Times New Roman" w:eastAsia="Times New Roman"/>
-          <w:b/>
-          <w:i w:val="0"/>
-          <w:sz w:val="26"/>
+          <w:b w:val="0"/>
         </w:rPr>
         <w:t>ĐIỀU 2. THỜI HẠN THUÊ VÀ BÀN GIAO</w:t>
       </w:r>
     </w:p>
     <w:p>
-      <w:pPr>
-        <w:keepNext w:val="0"/>
-        <w:widowControl/>
-        <w:spacing w:before="0" w:after="80" w:line="276" w:lineRule="auto"/>
-        <w:ind w:left="0" w:firstLine="0"/>
-        <w:jc w:val="both"/>
-      </w:pPr>
+      <w:pPr/>
       <w:r>
         <w:rPr>
-          <w:rFonts w:ascii="Times New Roman" w:hAnsi="Times New Roman" w:eastAsia="Times New Roman"/>
           <w:b w:val="0"/>
-          <w:i w:val="0"/>
-          <w:sz w:val="24"/>
+          <w:spacing w:val="-6"/>
         </w:rPr>
-        <w:t>2.1. Thời hạn thuê: {{lease.durationText}} ({{lease.durationMonths}} tháng), từ ngày {{lease.startDateText}} đến ngày {{lease.endDateText}}.</w:t>
+        <w:t xml:space="preserve">2.1. Thời hạn thuê: </w:t>
+      </w:r>
+      <w:r>
+        <w:rPr>
+          <w:b w:val="0"/>
+          <w:spacing w:val="-6"/>
+        </w:rPr>
+        <w:t>{{lease.durationText}}</w:t>
+      </w:r>
+      <w:r>
+        <w:rPr>
+          <w:b w:val="0"/>
+          <w:spacing w:val="-6"/>
+        </w:rPr>
+        <w:t xml:space="preserve"> (</w:t>
+      </w:r>
+      <w:r>
+        <w:rPr>
+          <w:b w:val="0"/>
+          <w:spacing w:val="-6"/>
+        </w:rPr>
+        <w:t>{{lease.durationMonths}}</w:t>
+      </w:r>
+      <w:r>
+        <w:rPr>
+          <w:b w:val="0"/>
+          <w:spacing w:val="-6"/>
+        </w:rPr>
+        <w:t xml:space="preserve"> tháng), từ ngày </w:t>
+      </w:r>
+      <w:r>
+        <w:rPr>
+          <w:b w:val="0"/>
+          <w:spacing w:val="-6"/>
+        </w:rPr>
+        <w:t>{{lease.startDateText}}</w:t>
+      </w:r>
+      <w:r>
+        <w:rPr>
+          <w:b w:val="0"/>
+          <w:spacing w:val="-6"/>
+        </w:rPr>
+        <w:t xml:space="preserve"> đến ngày </w:t>
+      </w:r>
+      <w:r>
+        <w:rPr>
+          <w:b w:val="0"/>
+          <w:spacing w:val="-6"/>
+        </w:rPr>
+        <w:t>{{lease.endDateText}}</w:t>
+      </w:r>
+      <w:r>
+        <w:rPr>
+          <w:b w:val="0"/>
+          <w:spacing w:val="-6"/>
+        </w:rPr>
+        <w:t>.</w:t>
+      </w:r>
+    </w:p>
+    <w:p>
+      <w:pPr/>
+      <w:r>
+        <w:rPr>
+          <w:b w:val="0"/>
+          <w:spacing w:val="-6"/>
+        </w:rPr>
+        <w:t xml:space="preserve">2.2. Ngày bàn giao: </w:t>
+      </w:r>
+      <w:r>
+        <w:rPr>
+          <w:b w:val="0"/>
+          <w:spacing w:val="-6"/>
+        </w:rPr>
+        <w:t>{{lease.handoverDateText}}</w:t>
+      </w:r>
+      <w:r>
+        <w:rPr>
+          <w:b w:val="0"/>
+          <w:spacing w:val="-6"/>
+        </w:rPr>
+        <w:t>.</w:t>
+      </w:r>
+    </w:p>
+    <w:p>
+      <w:pPr/>
+      <w:r>
+        <w:rPr>
+          <w:b w:val="0"/>
+          <w:spacing w:val="-6"/>
+        </w:rPr>
+        <w:t xml:space="preserve">2.3. Bàn giao chỉ số công tơ điện ban đầu: </w:t>
+      </w:r>
+      <w:r>
+        <w:rPr>
+          <w:b w:val="0"/>
+          <w:spacing w:val="-6"/>
+        </w:rPr>
+        <w:t>{{meters.electricityInitial}}</w:t>
+      </w:r>
+      <w:r>
+        <w:rPr>
+          <w:b w:val="0"/>
+          <w:spacing w:val="-6"/>
+        </w:rPr>
+        <w:t xml:space="preserve">; nước ban đầu: </w:t>
+      </w:r>
+      <w:r>
+        <w:rPr>
+          <w:b w:val="0"/>
+          <w:spacing w:val="-6"/>
+        </w:rPr>
+        <w:t>{{meters.waterInitial}}</w:t>
+      </w:r>
+      <w:r>
+        <w:rPr>
+          <w:b w:val="0"/>
+          <w:spacing w:val="-6"/>
+        </w:rPr>
+        <w:t xml:space="preserve"> (nếu chưa có sẽ lập tại Biên bản bàn giao khi nhận nhà).</w:t>
       </w:r>
     </w:p>
     <w:p>
       <w:pPr>
-        <w:keepNext w:val="0"/>
-        <w:widowControl/>
-        <w:spacing w:before="0" w:after="80" w:line="276" w:lineRule="auto"/>
-        <w:ind w:left="0" w:firstLine="0"/>
-        <w:jc w:val="both"/>
+        <w:pStyle w:val="ContractHeading"/>
       </w:pPr>
       <w:r>
         <w:rPr>
-          <w:rFonts w:ascii="Times New Roman" w:hAnsi="Times New Roman" w:eastAsia="Times New Roman"/>
           <w:b w:val="0"/>
-          <w:i w:val="0"/>
-          <w:sz w:val="24"/>
-        </w:rPr>
-        <w:t>2.2. Ngày bàn giao: {{lease.handoverDateText}}.</w:t>
-      </w:r>
-    </w:p>
-    <w:p>
-      <w:pPr>
-        <w:keepNext w:val="0"/>
-        <w:widowControl/>
-        <w:spacing w:before="0" w:after="80" w:line="276" w:lineRule="auto"/>
-        <w:ind w:left="0" w:firstLine="0"/>
-        <w:jc w:val="both"/>
-      </w:pPr>
-      <w:r>
-        <w:rPr>
-          <w:rFonts w:ascii="Times New Roman" w:hAnsi="Times New Roman" w:eastAsia="Times New Roman"/>
-          <w:b w:val="0"/>
-          <w:i w:val="0"/>
-          <w:sz w:val="24"/>
-        </w:rPr>
-        <w:t>2.3. Bàn giao chỉ số công tơ điện ban đầu: {{meters.electricityInitial}}; nước ban đầu: {{meters.waterInitial}} (nếu chưa có sẽ lập tại Biên bản bàn giao khi nhận nhà).</w:t>
-      </w:r>
-    </w:p>
-    <w:p>
-      <w:pPr>
-        <w:keepNext/>
-        <w:widowControl/>
-        <w:spacing w:before="160" w:after="80" w:line="276" w:lineRule="auto"/>
-        <w:ind w:left="0" w:firstLine="0"/>
-        <w:jc w:val="left"/>
-      </w:pPr>
-      <w:r>
-        <w:rPr>
-          <w:rFonts w:ascii="Times New Roman" w:hAnsi="Times New Roman" w:eastAsia="Times New Roman"/>
-          <w:b/>
-          <w:i w:val="0"/>
-          <w:sz w:val="26"/>
         </w:rPr>
         <w:t>ĐIỀU 3. GIÁ THUÊ, TIỀN CỌC VÀ PHƯƠNG THỨC CHUYỂN KHOẢN TRỰC TIẾP</w:t>
       </w:r>
     </w:p>
     <w:p>
-      <w:pPr>
-        <w:keepNext w:val="0"/>
-        <w:widowControl/>
-        <w:spacing w:before="0" w:after="80" w:line="276" w:lineRule="auto"/>
-        <w:ind w:left="0" w:firstLine="0"/>
-        <w:jc w:val="both"/>
-      </w:pPr>
+      <w:pPr/>
       <w:r>
         <w:rPr>
-          <w:rFonts w:ascii="Times New Roman" w:hAnsi="Times New Roman" w:eastAsia="Times New Roman"/>
           <w:b w:val="0"/>
-          <w:i w:val="0"/>
-          <w:sz w:val="24"/>
+          <w:spacing w:val="-6"/>
         </w:rPr>
-        <w:t>3.1. Giá thuê: {{rent.amountNumber}} (Bằng chữ: {{rent.amountWords}}).</w:t>
+        <w:t xml:space="preserve">3.1. Giá thuê: </w:t>
+      </w:r>
+      <w:r>
+        <w:rPr>
+          <w:b w:val="0"/>
+          <w:spacing w:val="-6"/>
+        </w:rPr>
+        <w:t>{{rent.amountNumber}}</w:t>
+      </w:r>
+      <w:r>
+        <w:rPr>
+          <w:b w:val="0"/>
+          <w:spacing w:val="-6"/>
+        </w:rPr>
+        <w:t xml:space="preserve"> (Bằng chữ: </w:t>
+      </w:r>
+      <w:r>
+        <w:rPr>
+          <w:b w:val="0"/>
+          <w:spacing w:val="-6"/>
+        </w:rPr>
+        <w:t>{{rent.amountWords}}</w:t>
+      </w:r>
+      <w:r>
+        <w:rPr>
+          <w:b w:val="0"/>
+          <w:spacing w:val="-6"/>
+        </w:rPr>
+        <w:t>).</w:t>
+      </w:r>
+    </w:p>
+    <w:p>
+      <w:pPr/>
+      <w:r>
+        <w:rPr>
+          <w:b w:val="0"/>
+          <w:spacing w:val="-6"/>
+        </w:rPr>
+        <w:t xml:space="preserve">3.2. Chu kỳ thanh toán: </w:t>
+      </w:r>
+      <w:r>
+        <w:rPr>
+          <w:b w:val="0"/>
+          <w:spacing w:val="-6"/>
+        </w:rPr>
+        <w:t>{{rent.paymentCycle}}</w:t>
+      </w:r>
+      <w:r>
+        <w:rPr>
+          <w:b w:val="0"/>
+          <w:spacing w:val="-6"/>
+        </w:rPr>
+        <w:t xml:space="preserve">; Hạn thanh toán định kỳ: </w:t>
+      </w:r>
+      <w:r>
+        <w:rPr>
+          <w:b w:val="0"/>
+          <w:spacing w:val="-6"/>
+        </w:rPr>
+        <w:t>{{rent.paymentDueDay}}</w:t>
+      </w:r>
+      <w:r>
+        <w:rPr>
+          <w:b w:val="0"/>
+          <w:spacing w:val="-6"/>
+        </w:rPr>
+        <w:t>.</w:t>
+      </w:r>
+    </w:p>
+    <w:p>
+      <w:pPr/>
+      <w:r>
+        <w:rPr>
+          <w:b w:val="0"/>
+          <w:spacing w:val="-6"/>
+        </w:rPr>
+        <w:t xml:space="preserve">3.3. Phương thức thanh toán: </w:t>
+      </w:r>
+      <w:r>
+        <w:rPr>
+          <w:b w:val="0"/>
+          <w:spacing w:val="-6"/>
+        </w:rPr>
+        <w:t>{{rent.paymentMethod}}</w:t>
+      </w:r>
+      <w:r>
+        <w:rPr>
+          <w:b w:val="0"/>
+          <w:spacing w:val="-6"/>
+        </w:rPr>
+        <w:t>.</w:t>
+      </w:r>
+    </w:p>
+    <w:p>
+      <w:pPr/>
+      <w:r>
+        <w:rPr>
+          <w:b w:val="0"/>
+          <w:spacing w:val="-6"/>
+        </w:rPr>
+        <w:t xml:space="preserve">3.4. Tiền đặt cọc: </w:t>
+      </w:r>
+      <w:r>
+        <w:rPr>
+          <w:b w:val="0"/>
+          <w:spacing w:val="-6"/>
+        </w:rPr>
+        <w:t>{{deposit.amountNumber}}</w:t>
+      </w:r>
+      <w:r>
+        <w:rPr>
+          <w:b w:val="0"/>
+          <w:spacing w:val="-6"/>
+        </w:rPr>
+        <w:t xml:space="preserve"> (Bằng chữ: </w:t>
+      </w:r>
+      <w:r>
+        <w:rPr>
+          <w:b w:val="0"/>
+          <w:spacing w:val="-6"/>
+        </w:rPr>
+        <w:t>{{deposit.amountWords}}</w:t>
+      </w:r>
+      <w:r>
+        <w:rPr>
+          <w:b w:val="0"/>
+          <w:spacing w:val="-6"/>
+        </w:rPr>
+        <w:t>).</w:t>
+      </w:r>
+    </w:p>
+    <w:p>
+      <w:pPr/>
+      <w:r>
+        <w:rPr>
+          <w:b w:val="0"/>
+          <w:spacing w:val="-6"/>
+        </w:rPr>
+        <w:t xml:space="preserve">3.5. Điều kiện hoàn trả/khấu trừ cọc: </w:t>
+      </w:r>
+      <w:r>
+        <w:rPr>
+          <w:b w:val="0"/>
+          <w:spacing w:val="-6"/>
+        </w:rPr>
+        <w:t>{{deposit.description}}</w:t>
+      </w:r>
+      <w:r>
+        <w:rPr>
+          <w:b w:val="0"/>
+          <w:spacing w:val="-6"/>
+        </w:rPr>
+        <w:t>.</w:t>
+      </w:r>
+    </w:p>
+    <w:p>
+      <w:pPr/>
+      <w:r>
+        <w:rPr>
+          <w:b w:val="0"/>
+          <w:spacing w:val="-6"/>
+        </w:rPr>
+        <w:t xml:space="preserve">3.6. Ngày ký hợp đồng và ngày bắt đầu kỳ thuê là hai mốc độc lập. Kỳ thuê được tính từ </w:t>
+      </w:r>
+      <w:r>
+        <w:rPr>
+          <w:b w:val="0"/>
+          <w:spacing w:val="-6"/>
+        </w:rPr>
+        <w:t>{{lease.startDateText}}</w:t>
+      </w:r>
+      <w:r>
+        <w:rPr>
+          <w:b w:val="0"/>
+          <w:spacing w:val="-6"/>
+        </w:rPr>
+        <w:t xml:space="preserve"> đến trước ngày tương ứng tháng kế tiếp; ngày cuối toàn thời hạn thuê ghi tại </w:t>
+      </w:r>
+      <w:r>
+        <w:rPr>
+          <w:b w:val="0"/>
+          <w:spacing w:val="-6"/>
+        </w:rPr>
+        <w:t>{{lease.endDateText}}</w:t>
+      </w:r>
+      <w:r>
+        <w:rPr>
+          <w:b w:val="0"/>
+          <w:spacing w:val="-6"/>
+        </w:rPr>
+        <w:t>.</w:t>
+      </w:r>
+    </w:p>
+    <w:p>
+      <w:pPr/>
+      <w:r>
+        <w:rPr>
+          <w:b w:val="0"/>
+          <w:spacing w:val="-6"/>
+        </w:rPr>
+        <w:t>3.7. Khoản thanh toán ban đầu gồm tiền thuê kỳ đầu và tiền đặt cọc (nếu có). Không mặc nhiên tính vào khoản này phí điện, nước và dịch vụ phát sinh chưa được xác nhận, và không thu lại tiền thuê kỳ đầu trên hóa đơn quyết toán kỳ đầu.</w:t>
+      </w:r>
+    </w:p>
+    <w:p>
+      <w:pPr/>
+      <w:r>
+        <w:rPr>
+          <w:b w:val="0"/>
+          <w:spacing w:val="-6"/>
+        </w:rPr>
+        <w:t>3.8. Khi kết thúc mỗi kỳ, hóa đơn quyết toán phí cố định, dịch vụ, gửi xe, điện, nước và phát sinh của kỳ vừa qua, đồng thời thu tiền thuê kỳ kế tiếp nếu còn kỳ thuê trong thời hạn hợp đồng. Kỳ cuối chỉ quyết toán chi phí, không thu tiền thuê vượt quá thời hạn. Số liệu sử dụng thực tế và đơn giá theo Bảng chi phí tại Điều 4.</w:t>
+      </w:r>
+    </w:p>
+    <w:p>
+      <w:pPr/>
+      <w:r>
+        <w:rPr>
+          <w:b w:val="0"/>
+          <w:spacing w:val="-6"/>
+        </w:rPr>
+        <w:t xml:space="preserve">3.9. Bên A có thể chốt chỉ số và phát hành hóa đơn ngay khi dữ liệu kỳ đã đầy đủ; Bên B được xem và thanh toán ngay khi hóa đơn phát hành. Hạn thanh toán áp dụng theo </w:t>
+      </w:r>
+      <w:r>
+        <w:rPr>
+          <w:b w:val="0"/>
+          <w:spacing w:val="-6"/>
+        </w:rPr>
+        <w:t>{{rent.paymentDueDay}}</w:t>
+      </w:r>
+      <w:r>
+        <w:rPr>
+          <w:b w:val="0"/>
+          <w:spacing w:val="-6"/>
+        </w:rPr>
+        <w:t xml:space="preserve"> và hạn cụ thể trên từng hóa đơn.</w:t>
+      </w:r>
+    </w:p>
+    <w:p>
+      <w:pPr/>
+      <w:r>
+        <w:rPr>
+          <w:b w:val="0"/>
+          <w:spacing w:val="-6"/>
+        </w:rPr>
+        <w:t>3.10. Quy định chi tiết về chuyển khoản trực tiếp và vai trò HomeSpace:</w:t>
       </w:r>
     </w:p>
     <w:p>
       <w:pPr>
-        <w:keepNext w:val="0"/>
-        <w:widowControl/>
-        <w:spacing w:before="0" w:after="80" w:line="276" w:lineRule="auto"/>
-        <w:ind w:left="0" w:firstLine="0"/>
-        <w:jc w:val="both"/>
+        <w:spacing w:after="80"/>
+        <w:ind w:left="113"/>
       </w:pPr>
       <w:r>
         <w:rPr>
-          <w:rFonts w:ascii="Times New Roman" w:hAnsi="Times New Roman" w:eastAsia="Times New Roman"/>
           <w:b w:val="0"/>
-          <w:i w:val="0"/>
-          <w:sz w:val="24"/>
+          <w:spacing w:val="-6"/>
         </w:rPr>
-        <w:t>3.2. Chu kỳ thanh toán: {{rent.paymentCycle}}; Hạn thanh toán định kỳ: {{rent.paymentDueDay}}.</w:t>
+        <w:t>1) Bên B thanh toán tiền thuê, tiền đặt cọc và các khoản phải trả khác bằng hình thức chuyển khoản trực tiếp vào tài khoản do Bên A chỉ định trong Hợp đồng này hoặc tài khoản thay thế được hai bên xác nhận bằng văn bản hoặc thông điệp dữ liệu.</w:t>
       </w:r>
     </w:p>
     <w:p>
       <w:pPr>
-        <w:keepNext w:val="0"/>
-        <w:widowControl/>
-        <w:spacing w:before="0" w:after="80" w:line="276" w:lineRule="auto"/>
-        <w:ind w:left="0" w:firstLine="0"/>
-        <w:jc w:val="both"/>
+        <w:spacing w:after="80"/>
+        <w:ind w:left="113"/>
       </w:pPr>
       <w:r>
         <w:rPr>
-          <w:rFonts w:ascii="Times New Roman" w:hAnsi="Times New Roman" w:eastAsia="Times New Roman"/>
           <w:b w:val="0"/>
-          <w:i w:val="0"/>
-          <w:sz w:val="24"/>
+          <w:spacing w:val="-6"/>
         </w:rPr>
-        <w:t>3.3. Phương thức thanh toán: {{rent.paymentMethod}}.</w:t>
+        <w:t>2) HomeSpace cung cấp công cụ tính toán khoản phải trả, tạo thông tin VietQR, lưu trữ yêu cầu thanh toán và ghi nhận trạng thái do các bên khai báo. HomeSpace không nhận tiền, không giữ tiền, không chuyển tiền thay các bên và không thay thế ngân hàng xác nhận việc ghi Có hoặc ghi Nợ trên tài khoản.</w:t>
       </w:r>
     </w:p>
     <w:p>
       <w:pPr>
-        <w:keepNext w:val="0"/>
-        <w:widowControl/>
-        <w:spacing w:before="0" w:after="80" w:line="276" w:lineRule="auto"/>
-        <w:ind w:left="0" w:firstLine="0"/>
-        <w:jc w:val="both"/>
+        <w:spacing w:after="80"/>
+        <w:ind w:left="113"/>
       </w:pPr>
       <w:r>
         <w:rPr>
-          <w:rFonts w:ascii="Times New Roman" w:hAnsi="Times New Roman" w:eastAsia="Times New Roman"/>
           <w:b w:val="0"/>
-          <w:i w:val="0"/>
-          <w:sz w:val="24"/>
+          <w:spacing w:val="-6"/>
         </w:rPr>
-        <w:t>3.4. Tiền đặt cọc: {{deposit.amountNumber}} (Bằng chữ: {{deposit.amountWords}}).</w:t>
+        <w:t>3) Một khoản thanh toán được ghi nhận hoàn tất trên HomeSpace sau khi Bên B khai báo đã thực hiện chuyển khoản và Bên A xác nhận đã nhận đủ số tiền tương ứng. Việc ghi nhận này được lập trên cơ sở xác nhận của các bên và không phải là xác nhận giao dịch do ngân hàng phát hành.</w:t>
       </w:r>
     </w:p>
     <w:p>
       <w:pPr>
-        <w:keepNext w:val="0"/>
-        <w:widowControl/>
-        <w:spacing w:before="0" w:after="80" w:line="276" w:lineRule="auto"/>
-        <w:ind w:left="0" w:firstLine="0"/>
-        <w:jc w:val="both"/>
+        <w:spacing w:after="80"/>
+        <w:ind w:left="113"/>
       </w:pPr>
       <w:r>
         <w:rPr>
-          <w:rFonts w:ascii="Times New Roman" w:hAnsi="Times New Roman" w:eastAsia="Times New Roman"/>
           <w:b w:val="0"/>
-          <w:i w:val="0"/>
-          <w:sz w:val="24"/>
+          <w:spacing w:val="-6"/>
         </w:rPr>
-        <w:t>3.5. Điều kiện hoàn trả/khấu trừ cọc: {{deposit.description}}.</w:t>
+        <w:t>4) Bên B có trách nhiệm kiểm tra tên chủ tài khoản, số tài khoản, ngân hàng thụ hưởng, số tiền và nội dung chuyển khoản trước khi thực hiện. Bên A có trách nhiệm kiểm tra tài khoản nhận và xác nhận trung thực trạng thái nhận tiền.</w:t>
       </w:r>
     </w:p>
     <w:p>
       <w:pPr>
-        <w:keepNext w:val="0"/>
-        <w:widowControl/>
-        <w:spacing w:before="0" w:after="80" w:line="276" w:lineRule="auto"/>
-        <w:ind w:left="0" w:firstLine="0"/>
-        <w:jc w:val="both"/>
+        <w:spacing w:after="80"/>
+        <w:ind w:left="113"/>
       </w:pPr>
       <w:r>
         <w:rPr>
-          <w:rFonts w:ascii="Times New Roman" w:hAnsi="Times New Roman" w:eastAsia="Times New Roman"/>
           <w:b w:val="0"/>
-          <w:i w:val="0"/>
-          <w:sz w:val="24"/>
+          <w:spacing w:val="-6"/>
         </w:rPr>
-        <w:t>3.6. Khoản ban đầu gồm tiền thuê kỳ đầu và cọc; không thu lại tiền thuê kỳ đầu trong hóa đơn quyết toán kỳ đầu. Mỗi hóa đơn cuối kỳ gồm dịch vụ/điện/nước/phát sinh của kỳ vừa qua và tiền thuê kỳ sau nếu còn kỳ thuê; kỳ cuối không thu tiền thuê ngoài thời hạn. Hạn cụ thể theo {{rent.paymentDueDay}} và hóa đơn, không mặc định ngày 05 hằng tháng. Bên A có thể chốt chỉ số và phát hành hóa đơn ngay khi dữ liệu kỳ đã đầy đủ; Bên B được xem và thanh toán ngay sau khi hóa đơn được phát hành.</w:t>
+        <w:t>5) Trường hợp thông tin khai báo giữa các bên không thống nhất, khoản thanh toán được chuyển sang trạng thái chờ đối soát. Các bên có trách nhiệm cung cấp chứng từ ngân hàng và phối hợp xác minh; HomeSpace chỉ lưu trữ thông tin, chứng từ và lịch sử xác nhận do các bên cung cấp.</w:t>
       </w:r>
     </w:p>
     <w:p>
       <w:pPr>
-        <w:keepNext/>
-        <w:widowControl/>
-        <w:spacing w:before="0" w:after="80" w:line="276" w:lineRule="auto"/>
-        <w:ind w:left="0" w:firstLine="0"/>
-        <w:jc w:val="both"/>
+        <w:spacing w:after="80"/>
+        <w:ind w:left="113"/>
       </w:pPr>
       <w:r>
         <w:rPr>
-          <w:rFonts w:ascii="Times New Roman" w:hAnsi="Times New Roman" w:eastAsia="Times New Roman"/>
           <w:b w:val="0"/>
-          <w:i w:val="0"/>
-          <w:sz w:val="24"/>
+          <w:spacing w:val="-6"/>
         </w:rPr>
-        <w:t>3.7. Quy định chi tiết về chuyển khoản trực tiếp và vai trò HomeSpace:</w:t>
+        <w:t>6) Mọi thay đổi tài khoản nhận thanh toán hoặc tài khoản nhận hoàn trả chỉ có hiệu lực đối với nghĩa vụ phát sinh sau khi bên còn lại đã nhận được và xác nhận thông báo thay đổi. Việc thay đổi tài khoản trên hồ sơ HomeSpace không tự động sửa đổi phiên bản hợp đồng đang có hiệu lực.</w:t>
       </w:r>
     </w:p>
     <w:p>
       <w:pPr>
-        <w:keepNext w:val="0"/>
-        <w:widowControl/>
-        <w:spacing w:before="0" w:after="60" w:line="276" w:lineRule="auto"/>
-        <w:ind w:left="227" w:hanging="170"/>
-        <w:jc w:val="both"/>
+        <w:spacing w:after="80"/>
+        <w:ind w:left="113"/>
       </w:pPr>
       <w:r>
         <w:rPr>
-          <w:rFonts w:ascii="Times New Roman" w:hAnsi="Times New Roman" w:eastAsia="Times New Roman"/>
           <w:b w:val="0"/>
-          <w:i w:val="0"/>
-          <w:sz w:val="24"/>
+          <w:spacing w:val="-6"/>
         </w:rPr>
-        <w:t>+ Bên B thanh toán tiền thuê, tiền đặt cọc và các khoản phải trả khác bằng hình thức chuyển khoản trực tiếp vào tài khoản do Bên A chỉ định trong Hợp đồng này hoặc tài khoản thay thế được hai bên xác nhận bằng văn bản hoặc thông điệp dữ liệu.</w:t>
+        <w:t>7) Khi chấm dứt hoặc hết hạn hợp đồng, sau khi hai bên hoàn tất bàn giao và quyết toán, Bên A chuyển khoản số tiền cọc còn phải hoàn trực tiếp vào tài khoản nhận hoàn trả của Bên B ghi trong Hợp đồng hoặc tài khoản khác được hai bên xác nhận. Việc hoàn cọc được ghi nhận hoàn tất sau khi Bên A khai báo đã chuyển và Bên B xác nhận đã nhận đủ tiền.</w:t>
+      </w:r>
+    </w:p>
+    <w:p>
+      <w:pPr/>
+      <w:r>
+        <w:rPr>
+          <w:b w:val="0"/>
+          <w:spacing w:val="-6"/>
+        </w:rPr>
+        <w:t>3.11. Bảng ghi nhận thanh toán ban đầu đã được hai bên xác nhận:</w:t>
       </w:r>
     </w:p>
     <w:p>
       <w:pPr>
-        <w:keepNext w:val="0"/>
-        <w:widowControl/>
-        <w:spacing w:before="0" w:after="60" w:line="276" w:lineRule="auto"/>
-        <w:ind w:left="227" w:hanging="170"/>
-        <w:jc w:val="both"/>
-      </w:pPr>
-      <w:r>
-        <w:rPr>
-          <w:rFonts w:ascii="Times New Roman" w:hAnsi="Times New Roman" w:eastAsia="Times New Roman"/>
-          <w:b w:val="0"/>
-          <w:i w:val="0"/>
-          <w:sz w:val="24"/>
-        </w:rPr>
-        <w:t>+ HomeSpace cung cấp công cụ tính toán khoản phải trả, tạo thông tin VietQR, lưu trữ yêu cầu thanh toán và ghi nhận trạng thái do các bên khai báo. HomeSpace không nhận tiền, không giữ tiền, không chuyển tiền thay các bên và không thay thế ngân hàng xác nhận việc ghi Có hoặc ghi Nợ trên tài khoản.</w:t>
-      </w:r>
-    </w:p>
-    <w:p>
-      <w:pPr>
-        <w:keepNext w:val="0"/>
-        <w:widowControl/>
-        <w:spacing w:before="0" w:after="60" w:line="276" w:lineRule="auto"/>
-        <w:ind w:left="227" w:hanging="170"/>
-        <w:jc w:val="both"/>
-      </w:pPr>
-      <w:r>
-        <w:rPr>
-          <w:rFonts w:ascii="Times New Roman" w:hAnsi="Times New Roman" w:eastAsia="Times New Roman"/>
-          <w:b w:val="0"/>
-          <w:i w:val="0"/>
-          <w:sz w:val="24"/>
-        </w:rPr>
-        <w:t>+ Một khoản thanh toán được ghi nhận hoàn tất trên HomeSpace sau khi Bên B khai báo đã thực hiện chuyển khoản và Bên A xác nhận đã nhận đủ số tiền tương ứng. Việc ghi nhận này được lập trên cơ sở xác nhận của các bên và không phải là xác nhận giao dịch do ngân hàng phát hành.</w:t>
-      </w:r>
-    </w:p>
-    <w:p>
-      <w:pPr>
-        <w:keepNext w:val="0"/>
-        <w:widowControl/>
-        <w:spacing w:before="0" w:after="60" w:line="276" w:lineRule="auto"/>
-        <w:ind w:left="227" w:hanging="170"/>
-        <w:jc w:val="both"/>
-      </w:pPr>
-      <w:r>
-        <w:rPr>
-          <w:rFonts w:ascii="Times New Roman" w:hAnsi="Times New Roman" w:eastAsia="Times New Roman"/>
-          <w:b w:val="0"/>
-          <w:i w:val="0"/>
-          <w:sz w:val="24"/>
-        </w:rPr>
-        <w:t>+ Bên B có trách nhiệm kiểm tra tên chủ tài khoản, số tài khoản, ngân hàng thụ hưởng, số tiền và nội dung chuyển khoản trước khi thực hiện. Bên A có trách nhiệm kiểm tra tài khoản nhận và xác nhận trung thực trạng thái nhận tiền.</w:t>
-      </w:r>
-    </w:p>
-    <w:p>
-      <w:pPr>
-        <w:keepNext w:val="0"/>
-        <w:widowControl/>
-        <w:spacing w:before="0" w:after="60" w:line="276" w:lineRule="auto"/>
-        <w:ind w:left="227" w:hanging="170"/>
-        <w:jc w:val="both"/>
-      </w:pPr>
-      <w:r>
-        <w:rPr>
-          <w:rFonts w:ascii="Times New Roman" w:hAnsi="Times New Roman" w:eastAsia="Times New Roman"/>
-          <w:b w:val="0"/>
-          <w:i w:val="0"/>
-          <w:sz w:val="24"/>
-        </w:rPr>
-        <w:t>+ Trường hợp thông tin khai báo giữa các bên không thống nhất, khoản thanh toán được chuyển sang trạng thái chờ đối soát. Các bên có trách nhiệm cung cấp chứng từ ngân hàng và phối hợp xác minh; HomeSpace chỉ lưu trữ thông tin, chứng từ và lịch sử xác nhận do các bên cung cấp.</w:t>
-      </w:r>
-    </w:p>
-    <w:p>
-      <w:pPr>
-        <w:keepNext w:val="0"/>
-        <w:widowControl/>
-        <w:spacing w:before="0" w:after="60" w:line="276" w:lineRule="auto"/>
-        <w:ind w:left="227" w:hanging="170"/>
-        <w:jc w:val="both"/>
-      </w:pPr>
-      <w:r>
-        <w:rPr>
-          <w:rFonts w:ascii="Times New Roman" w:hAnsi="Times New Roman" w:eastAsia="Times New Roman"/>
-          <w:b w:val="0"/>
-          <w:i w:val="0"/>
-          <w:sz w:val="24"/>
-        </w:rPr>
-        <w:t>+ Mọi thay đổi tài khoản nhận thanh toán hoặc tài khoản nhận hoàn trả chỉ có hiệu lực đối với nghĩa vụ phát sinh sau khi bên còn lại đã nhận được và xác nhận thông báo thay đổi. Việc thay đổi tài khoản trên hồ sơ HomeSpace không tự động sửa đổi phiên bản hợp đồng đang có hiệu lực.</w:t>
-      </w:r>
-    </w:p>
-    <w:p>
-      <w:pPr>
-        <w:keepNext w:val="0"/>
-        <w:widowControl/>
-        <w:spacing w:before="0" w:after="60" w:line="276" w:lineRule="auto"/>
-        <w:ind w:left="227" w:hanging="170"/>
-        <w:jc w:val="both"/>
-      </w:pPr>
-      <w:r>
-        <w:rPr>
-          <w:rFonts w:ascii="Times New Roman" w:hAnsi="Times New Roman" w:eastAsia="Times New Roman"/>
-          <w:b w:val="0"/>
-          <w:i w:val="0"/>
-          <w:sz w:val="24"/>
-        </w:rPr>
-        <w:t>+ Khi chấm dứt hoặc hết hạn hợp đồng, sau khi hai bên hoàn tất bàn giao và quyết toán, Bên A chuyển khoản số tiền cọc còn phải hoàn trực tiếp vào tài khoản nhận hoàn trả của Bên B ghi trong Hợp đồng hoặc tài khoản khác được hai bên xác nhận. Việc hoàn cọc được ghi nhận hoàn tất sau khi Bên A khai báo đã chuyển và Bên B xác nhận đã nhận đủ tiền.</w:t>
-      </w:r>
-    </w:p>
-    <w:p>
-      <w:pPr>
-        <w:keepNext/>
-        <w:widowControl/>
-        <w:spacing w:before="0" w:after="80" w:line="276" w:lineRule="auto"/>
-        <w:ind w:left="0" w:firstLine="0"/>
-        <w:jc w:val="both"/>
-      </w:pPr>
-      <w:r>
-        <w:rPr>
-          <w:rFonts w:ascii="Times New Roman" w:hAnsi="Times New Roman" w:eastAsia="Times New Roman"/>
-          <w:b w:val="0"/>
-          <w:i w:val="0"/>
-          <w:sz w:val="24"/>
-        </w:rPr>
-        <w:t>3.8. Bảng ghi nhận thanh toán ban đầu đã được hai bên xác nhận:</w:t>
-      </w:r>
-    </w:p>
-    <w:p>
-      <w:pPr>
-        <w:keepNext w:val="0"/>
-        <w:widowControl/>
-        <w:spacing w:before="20" w:after="100" w:line="276" w:lineRule="auto"/>
-        <w:ind w:left="0" w:firstLine="0"/>
+        <w:pStyle w:val="ContractMarker"/>
+        <w:spacing w:after="80"/>
         <w:jc w:val="left"/>
       </w:pPr>
       <w:r>
         <w:rPr>
-          <w:rFonts w:ascii="Times New Roman" w:hAnsi="Times New Roman" w:eastAsia="Times New Roman"/>
           <w:b w:val="0"/>
-          <w:i w:val="0"/>
-          <w:sz w:val="24"/>
+          <w:spacing w:val="-6"/>
         </w:rPr>
         <w:t>{{#initialPaymentTable}}</w:t>
       </w:r>
     </w:p>
     <w:p>
-      <w:pPr>
-        <w:keepNext w:val="0"/>
-        <w:widowControl/>
-        <w:spacing w:before="0" w:after="80" w:line="276" w:lineRule="auto"/>
-        <w:ind w:left="0" w:firstLine="0"/>
-        <w:jc w:val="both"/>
-      </w:pPr>
+      <w:pPr/>
       <w:r>
         <w:rPr>
-          <w:rFonts w:ascii="Times New Roman" w:hAnsi="Times New Roman" w:eastAsia="Times New Roman"/>
           <w:b w:val="0"/>
-          <w:i w:val="0"/>
-          <w:sz w:val="24"/>
+          <w:spacing w:val="-6"/>
         </w:rPr>
-        <w:t>3.9. Mã nội dung chuyển khoản: {{payment.initial.transferReference}}; Mã tham chiếu giao dịch ngân hàng: {{payment.initial.bankTransactionReference}}; Bên B khai báo chuyển: {{payment.initial.payerReportedAt}}; Bên A xác nhận nhận: {{payment.initial.payeeConfirmedAt}}; Hoàn tất xác nhận hai chiều: {{payment.initial.confirmedAt}}; Trạng thái xác nhận: {{payment.initial.status}}; Tổng số tiền ban đầu: {{payment.initial.totalAmount}}; Thời điểm hoàn tất (tương thích V2): {{payment.initial.paidAt}}; Mã giao dịch đối chiếu (tương thích V2): {{payment.initial.transactionCode}}.</w:t>
+        <w:t xml:space="preserve">3.12. Mã nội dung chuyển khoản: </w:t>
+      </w:r>
+      <w:r>
+        <w:rPr>
+          <w:b w:val="0"/>
+          <w:spacing w:val="-6"/>
+        </w:rPr>
+        <w:t>{{payment.initial.transferReference}}</w:t>
+      </w:r>
+      <w:r>
+        <w:rPr>
+          <w:b w:val="0"/>
+          <w:spacing w:val="-6"/>
+        </w:rPr>
+        <w:t xml:space="preserve">; Bên B khai báo chuyển: </w:t>
+      </w:r>
+      <w:r>
+        <w:rPr>
+          <w:b w:val="0"/>
+          <w:spacing w:val="-6"/>
+        </w:rPr>
+        <w:t>{{payment.initial.payerReportedAt}}</w:t>
+      </w:r>
+      <w:r>
+        <w:rPr>
+          <w:b w:val="0"/>
+          <w:spacing w:val="-6"/>
+        </w:rPr>
+        <w:t xml:space="preserve">; Bên A xác nhận nhận: </w:t>
+      </w:r>
+      <w:r>
+        <w:rPr>
+          <w:b w:val="0"/>
+          <w:spacing w:val="-6"/>
+        </w:rPr>
+        <w:t>{{payment.initial.payeeConfirmedAt}}</w:t>
+      </w:r>
+      <w:r>
+        <w:rPr>
+          <w:b w:val="0"/>
+          <w:spacing w:val="-6"/>
+        </w:rPr>
+        <w:t xml:space="preserve">; Trạng thái xác nhận: </w:t>
+      </w:r>
+      <w:r>
+        <w:rPr>
+          <w:b w:val="0"/>
+          <w:spacing w:val="-6"/>
+        </w:rPr>
+        <w:t>{{payment.initial.status}}</w:t>
+      </w:r>
+      <w:r>
+        <w:rPr>
+          <w:b w:val="0"/>
+          <w:spacing w:val="-6"/>
+        </w:rPr>
+        <w:t>.</w:t>
       </w:r>
     </w:p>
     <w:p>
       <w:pPr>
-        <w:keepNext/>
-        <w:widowControl/>
-        <w:spacing w:before="160" w:after="80" w:line="276" w:lineRule="auto"/>
-        <w:ind w:left="0" w:firstLine="0"/>
-        <w:jc w:val="left"/>
+        <w:pStyle w:val="ContractHeading"/>
       </w:pPr>
       <w:r>
         <w:rPr>
-          <w:rFonts w:ascii="Times New Roman" w:hAnsi="Times New Roman" w:eastAsia="Times New Roman"/>
-          <w:b/>
-          <w:i w:val="0"/>
-          <w:sz w:val="26"/>
+          <w:b w:val="0"/>
         </w:rPr>
         <w:t>ĐIỀU 4. CÁC KHOẢN CHI PHÍ KHÁC VÀ DỊCH VỤ</w:t>
       </w:r>
     </w:p>
     <w:p>
-      <w:pPr>
-        <w:keepNext/>
-        <w:widowControl/>
-        <w:spacing w:before="0" w:after="80" w:line="276" w:lineRule="auto"/>
-        <w:ind w:left="0" w:firstLine="0"/>
-        <w:jc w:val="both"/>
-      </w:pPr>
+      <w:pPr/>
       <w:r>
         <w:rPr>
-          <w:rFonts w:ascii="Times New Roman" w:hAnsi="Times New Roman" w:eastAsia="Times New Roman"/>
           <w:b w:val="0"/>
-          <w:i w:val="0"/>
-          <w:sz w:val="24"/>
+          <w:spacing w:val="-6"/>
         </w:rPr>
         <w:t>4.1. Bảng chi phí định kỳ và dịch vụ đi kèm:</w:t>
       </w:r>
     </w:p>
     <w:p>
       <w:pPr>
-        <w:keepNext w:val="0"/>
-        <w:widowControl/>
-        <w:spacing w:before="20" w:after="100" w:line="276" w:lineRule="auto"/>
-        <w:ind w:left="0" w:firstLine="0"/>
+        <w:pStyle w:val="ContractMarker"/>
+        <w:spacing w:after="80"/>
         <w:jc w:val="left"/>
       </w:pPr>
       <w:r>
         <w:rPr>
-          <w:rFonts w:ascii="Times New Roman" w:hAnsi="Times New Roman" w:eastAsia="Times New Roman"/>
           <w:b w:val="0"/>
-          <w:i w:val="0"/>
-          <w:sz w:val="24"/>
+          <w:spacing w:val="-6"/>
         </w:rPr>
         <w:t>{{#chargesTable}}</w:t>
       </w:r>
     </w:p>
     <w:p>
-      <w:pPr>
-        <w:keepNext/>
-        <w:widowControl/>
-        <w:spacing w:before="0" w:after="80" w:line="276" w:lineRule="auto"/>
-        <w:ind w:left="0" w:firstLine="0"/>
-        <w:jc w:val="both"/>
-      </w:pPr>
+      <w:pPr/>
       <w:r>
         <w:rPr>
-          <w:rFonts w:ascii="Times New Roman" w:hAnsi="Times New Roman" w:eastAsia="Times New Roman"/>
           <w:b w:val="0"/>
-          <w:i w:val="0"/>
-          <w:sz w:val="24"/>
+          <w:spacing w:val="-6"/>
         </w:rPr>
-        <w:t>4.2. Bảng tiện ích và quyền sử dụng dịch vụ:</w:t>
+        <w:t>4.2. Bảng tiện ích đã ghi nhận:</w:t>
       </w:r>
     </w:p>
     <w:p>
       <w:pPr>
-        <w:keepNext w:val="0"/>
-        <w:widowControl/>
-        <w:spacing w:before="20" w:after="100" w:line="276" w:lineRule="auto"/>
-        <w:ind w:left="0" w:firstLine="0"/>
+        <w:pStyle w:val="ContractMarker"/>
+        <w:spacing w:after="80"/>
         <w:jc w:val="left"/>
       </w:pPr>
       <w:r>
         <w:rPr>
-          <w:rFonts w:ascii="Times New Roman" w:hAnsi="Times New Roman" w:eastAsia="Times New Roman"/>
           <w:b w:val="0"/>
-          <w:i w:val="0"/>
-          <w:sz w:val="24"/>
+          <w:spacing w:val="-6"/>
         </w:rPr>
         <w:t>{{#amenitiesTable}}</w:t>
       </w:r>
     </w:p>
     <w:p>
       <w:pPr>
-        <w:keepNext w:val="0"/>
-        <w:widowControl/>
-        <w:spacing w:before="0" w:after="80" w:line="276" w:lineRule="auto"/>
-        <w:ind w:left="0" w:firstLine="0"/>
-        <w:jc w:val="both"/>
+        <w:pStyle w:val="ContractHeading"/>
       </w:pPr>
       <w:r>
         <w:rPr>
-          <w:rFonts w:ascii="Times New Roman" w:hAnsi="Times New Roman" w:eastAsia="Times New Roman"/>
           <w:b w:val="0"/>
-          <w:i w:val="0"/>
-          <w:sz w:val="24"/>
-        </w:rPr>
-        <w:t>4.3. Đối với tiện ích dùng chung (nếu có), Bên B được quyền sử dụng các tiện ích chung theo nội quy, khung giờ và tình trạng vận hành của đơn vị quản lý.</w:t>
-      </w:r>
-    </w:p>
-    <w:p>
-      <w:pPr>
-        <w:keepNext/>
-        <w:widowControl/>
-        <w:spacing w:before="160" w:after="80" w:line="276" w:lineRule="auto"/>
-        <w:ind w:left="0" w:firstLine="0"/>
-        <w:jc w:val="left"/>
-      </w:pPr>
-      <w:r>
-        <w:rPr>
-          <w:rFonts w:ascii="Times New Roman" w:hAnsi="Times New Roman" w:eastAsia="Times New Roman"/>
-          <w:b/>
-          <w:i w:val="0"/>
-          <w:sz w:val="26"/>
         </w:rPr>
         <w:t>ĐIỀU 5. TÀI SẢN VÀ THIẾT BỊ BÀN GIAO</w:t>
       </w:r>
     </w:p>
     <w:p>
-      <w:pPr>
-        <w:keepNext/>
-        <w:widowControl/>
-        <w:spacing w:before="0" w:after="80" w:line="276" w:lineRule="auto"/>
-        <w:ind w:left="0" w:firstLine="0"/>
-        <w:jc w:val="both"/>
-      </w:pPr>
+      <w:pPr/>
       <w:r>
         <w:rPr>
-          <w:rFonts w:ascii="Times New Roman" w:hAnsi="Times New Roman" w:eastAsia="Times New Roman"/>
           <w:b w:val="0"/>
-          <w:i w:val="0"/>
-          <w:sz w:val="24"/>
+          <w:spacing w:val="-6"/>
         </w:rPr>
         <w:t>5.1. Danh mục trang thiết bị, nội thất gắn liền căn nhà:</w:t>
       </w:r>
     </w:p>
     <w:p>
       <w:pPr>
-        <w:keepNext w:val="0"/>
-        <w:widowControl/>
-        <w:spacing w:before="20" w:after="100" w:line="276" w:lineRule="auto"/>
-        <w:ind w:left="0" w:firstLine="0"/>
+        <w:pStyle w:val="ContractMarker"/>
+        <w:spacing w:after="80"/>
         <w:jc w:val="left"/>
       </w:pPr>
       <w:r>
         <w:rPr>
-          <w:rFonts w:ascii="Times New Roman" w:hAnsi="Times New Roman" w:eastAsia="Times New Roman"/>
           <w:b w:val="0"/>
-          <w:i w:val="0"/>
-          <w:sz w:val="24"/>
+          <w:spacing w:val="-6"/>
         </w:rPr>
         <w:t>{{#equipmentTable}}</w:t>
       </w:r>
     </w:p>
     <w:p>
-      <w:pPr>
-        <w:keepNext w:val="0"/>
-        <w:widowControl/>
-        <w:spacing w:before="0" w:after="80" w:line="276" w:lineRule="auto"/>
-        <w:ind w:left="0" w:firstLine="0"/>
-        <w:jc w:val="both"/>
-      </w:pPr>
+      <w:pPr/>
       <w:r>
         <w:rPr>
-          <w:rFonts w:ascii="Times New Roman" w:hAnsi="Times New Roman" w:eastAsia="Times New Roman"/>
           <w:b w:val="0"/>
-          <w:i w:val="0"/>
-          <w:sz w:val="24"/>
+          <w:spacing w:val="-6"/>
         </w:rPr>
-        <w:t>5.2. Bên B có trách nhiệm bảo quản nguyên vẹn, không tự ý thay đổi kết cấu chịu lực, không đục phá tường, cơi nới nếu chưa có sự đồng ý bằng văn bản của Bên A.</w:t>
+        <w:t>5.2. Bên B có trách nhiệm bảo quản tài sản; việc sửa chữa/cải tạo/lắp đặt tuân theo Bảng chính sách và quy định pháp luật, bảo đảm an toàn kết cấu và PCCC.</w:t>
       </w:r>
     </w:p>
     <w:p>
       <w:pPr>
-        <w:keepNext/>
-        <w:widowControl/>
-        <w:spacing w:before="160" w:after="80" w:line="276" w:lineRule="auto"/>
-        <w:ind w:left="0" w:firstLine="0"/>
-        <w:jc w:val="left"/>
+        <w:pStyle w:val="ContractHeading"/>
       </w:pPr>
       <w:r>
         <w:rPr>
-          <w:rFonts w:ascii="Times New Roman" w:hAnsi="Times New Roman" w:eastAsia="Times New Roman"/>
-          <w:b/>
-          <w:i w:val="0"/>
-          <w:sz w:val="26"/>
+          <w:b w:val="0"/>
         </w:rPr>
         <w:t>ĐIỀU 6. QUYỀN VÀ NGHĨA VỤ CỦA BÊN A</w:t>
       </w:r>
     </w:p>
     <w:p>
-      <w:pPr>
-        <w:keepNext w:val="0"/>
-        <w:widowControl/>
-        <w:spacing w:before="0" w:after="80" w:line="276" w:lineRule="auto"/>
-        <w:ind w:left="0" w:firstLine="0"/>
-        <w:jc w:val="both"/>
-      </w:pPr>
+      <w:pPr/>
       <w:r>
         <w:rPr>
-          <w:rFonts w:ascii="Times New Roman" w:hAnsi="Times New Roman" w:eastAsia="Times New Roman"/>
           <w:b w:val="0"/>
-          <w:i w:val="0"/>
-          <w:sz w:val="24"/>
+          <w:spacing w:val="-6"/>
         </w:rPr>
         <w:t>6.1. Bàn giao nhà và thiết bị đúng hạn; bảo đảm quyền sử dụng độc lập, hợp pháp cho Bên B.</w:t>
       </w:r>
     </w:p>
     <w:p>
-      <w:pPr>
-        <w:keepNext w:val="0"/>
-        <w:widowControl/>
-        <w:spacing w:before="0" w:after="80" w:line="276" w:lineRule="auto"/>
-        <w:ind w:left="0" w:firstLine="0"/>
-        <w:jc w:val="both"/>
-      </w:pPr>
+      <w:pPr/>
       <w:r>
         <w:rPr>
-          <w:rFonts w:ascii="Times New Roman" w:hAnsi="Times New Roman" w:eastAsia="Times New Roman"/>
           <w:b w:val="0"/>
-          <w:i w:val="0"/>
-          <w:sz w:val="24"/>
+          <w:spacing w:val="-6"/>
         </w:rPr>
         <w:t>6.2. Cung cấp tài khoản ngân hàng chính xác để nhận thanh toán; kiểm tra và xác nhận kịp thời khi nhận được tiền.</w:t>
       </w:r>
     </w:p>
     <w:p>
-      <w:pPr>
-        <w:keepNext w:val="0"/>
-        <w:widowControl/>
-        <w:spacing w:before="0" w:after="80" w:line="276" w:lineRule="auto"/>
-        <w:ind w:left="0" w:firstLine="0"/>
-        <w:jc w:val="both"/>
-      </w:pPr>
+      <w:pPr/>
       <w:r>
         <w:rPr>
-          <w:rFonts w:ascii="Times New Roman" w:hAnsi="Times New Roman" w:eastAsia="Times New Roman"/>
           <w:b w:val="0"/>
-          <w:i w:val="0"/>
-          <w:sz w:val="24"/>
+          <w:spacing w:val="-6"/>
         </w:rPr>
         <w:t>6.3. Hướng dẫn thủ tục đăng ký tạm trú theo Luật Cư trú; bảo trì kết cấu căn nhà theo thỏa thuận.</w:t>
       </w:r>
     </w:p>
     <w:p>
       <w:pPr>
-        <w:keepNext/>
-        <w:widowControl/>
-        <w:spacing w:before="160" w:after="80" w:line="276" w:lineRule="auto"/>
-        <w:ind w:left="0" w:firstLine="0"/>
-        <w:jc w:val="left"/>
+        <w:pStyle w:val="ContractHeading"/>
       </w:pPr>
       <w:r>
         <w:rPr>
-          <w:rFonts w:ascii="Times New Roman" w:hAnsi="Times New Roman" w:eastAsia="Times New Roman"/>
-          <w:b/>
-          <w:i w:val="0"/>
-          <w:sz w:val="26"/>
+          <w:b w:val="0"/>
         </w:rPr>
         <w:t>ĐIỀU 7. QUYỀN VÀ NGHĨA VỤ CỦA BÊN B</w:t>
       </w:r>
     </w:p>
     <w:p>
-      <w:pPr>
-        <w:keepNext w:val="0"/>
-        <w:widowControl/>
-        <w:spacing w:before="0" w:after="80" w:line="276" w:lineRule="auto"/>
-        <w:ind w:left="0" w:firstLine="0"/>
-        <w:jc w:val="both"/>
-      </w:pPr>
+      <w:pPr/>
       <w:r>
         <w:rPr>
-          <w:rFonts w:ascii="Times New Roman" w:hAnsi="Times New Roman" w:eastAsia="Times New Roman"/>
           <w:b w:val="0"/>
-          <w:i w:val="0"/>
-          <w:sz w:val="24"/>
+          <w:spacing w:val="-6"/>
         </w:rPr>
-        <w:t>7.1. Sử dụng đúng số lượng người cư trú ({{tenant.occupantCount}} người), đúng số lượng phương tiện đăng ký ({{tenant.motorbikeCount}} xe máy, {{tenant.carCount}} ô tô).</w:t>
+        <w:t>7.1. Sử dụng đúng số lượng người cư trú (</w:t>
+      </w:r>
+      <w:r>
+        <w:rPr>
+          <w:b w:val="0"/>
+          <w:spacing w:val="-6"/>
+        </w:rPr>
+        <w:t>{{tenant.occupantCount}}</w:t>
+      </w:r>
+      <w:r>
+        <w:rPr>
+          <w:b w:val="0"/>
+          <w:spacing w:val="-6"/>
+        </w:rPr>
+        <w:t xml:space="preserve"> người), đúng số lượng phương tiện đăng ký (</w:t>
+      </w:r>
+      <w:r>
+        <w:rPr>
+          <w:b w:val="0"/>
+          <w:spacing w:val="-6"/>
+        </w:rPr>
+        <w:t>{{tenant.motorbikeCount}}</w:t>
+      </w:r>
+      <w:r>
+        <w:rPr>
+          <w:b w:val="0"/>
+          <w:spacing w:val="-6"/>
+        </w:rPr>
+        <w:t xml:space="preserve"> xe máy, </w:t>
+      </w:r>
+      <w:r>
+        <w:rPr>
+          <w:b w:val="0"/>
+          <w:spacing w:val="-6"/>
+        </w:rPr>
+        <w:t>{{tenant.carCount}}</w:t>
+      </w:r>
+      <w:r>
+        <w:rPr>
+          <w:b w:val="0"/>
+          <w:spacing w:val="-6"/>
+        </w:rPr>
+        <w:t xml:space="preserve"> ô tô).</w:t>
       </w:r>
     </w:p>
     <w:p>
-      <w:pPr>
-        <w:keepNext w:val="0"/>
-        <w:widowControl/>
-        <w:spacing w:before="0" w:after="80" w:line="276" w:lineRule="auto"/>
-        <w:ind w:left="0" w:firstLine="0"/>
-        <w:jc w:val="both"/>
-      </w:pPr>
+      <w:pPr/>
       <w:r>
         <w:rPr>
-          <w:rFonts w:ascii="Times New Roman" w:hAnsi="Times New Roman" w:eastAsia="Times New Roman"/>
           <w:b w:val="0"/>
-          <w:i w:val="0"/>
-          <w:sz w:val="24"/>
+          <w:spacing w:val="-6"/>
         </w:rPr>
-        <w:t>7.2. Chấp hành tuyệt đối các quy định an toàn PCCC theo Luật PCCC 2024, an ninh trật tự địa phương.</w:t>
+        <w:t>7.2. Chấp hành các quy định an toàn PCCC theo Luật PCCC 2024 và an ninh trật tự địa phương.</w:t>
       </w:r>
     </w:p>
     <w:p>
-      <w:pPr>
-        <w:keepNext w:val="0"/>
-        <w:widowControl/>
-        <w:spacing w:before="0" w:after="80" w:line="276" w:lineRule="auto"/>
-        <w:ind w:left="0" w:firstLine="0"/>
-        <w:jc w:val="both"/>
-      </w:pPr>
+      <w:pPr/>
       <w:r>
         <w:rPr>
-          <w:rFonts w:ascii="Times New Roman" w:hAnsi="Times New Roman" w:eastAsia="Times New Roman"/>
           <w:b w:val="0"/>
-          <w:i w:val="0"/>
-          <w:sz w:val="24"/>
+          <w:spacing w:val="-6"/>
         </w:rPr>
         <w:t>7.3. Chuyển khoản tiền thuê và chi phí đầy đủ, đúng hạn vào tài khoản ngân hàng của Bên A.</w:t>
       </w:r>
     </w:p>
     <w:p>
       <w:pPr>
-        <w:keepNext/>
-        <w:widowControl/>
-        <w:spacing w:before="160" w:after="80" w:line="276" w:lineRule="auto"/>
-        <w:ind w:left="0" w:firstLine="0"/>
+        <w:pStyle w:val="ContractHeading"/>
+      </w:pPr>
+      <w:r>
+        <w:rPr>
+          <w:b w:val="0"/>
+        </w:rPr>
+        <w:t>ĐIỀU 8. CHÍNH SÁCH VẬN HÀNH VÀ ĐIỀU KHOẢN THỎA THUẬN BỔ SUNG</w:t>
+      </w:r>
+    </w:p>
+    <w:p>
+      <w:pPr/>
+      <w:r>
+        <w:rPr>
+          <w:b w:val="0"/>
+          <w:spacing w:val="-6"/>
+        </w:rPr>
+        <w:t>8.1. Chính sách vận hành áp dụng cho tài sản thuê được ghi tại bảng sau:</w:t>
+      </w:r>
+    </w:p>
+    <w:p>
+      <w:pPr>
+        <w:pStyle w:val="ContractMarker"/>
+        <w:spacing w:after="80"/>
         <w:jc w:val="left"/>
       </w:pPr>
       <w:r>
         <w:rPr>
-          <w:rFonts w:ascii="Times New Roman" w:hAnsi="Times New Roman" w:eastAsia="Times New Roman"/>
-          <w:b/>
-          <w:i w:val="0"/>
-          <w:sz w:val="26"/>
+          <w:b w:val="0"/>
+          <w:spacing w:val="-6"/>
         </w:rPr>
-        <w:t>ĐIỀU 8. ĐIỀU KHOẢN ĐẶC THÙ VỀ THÚ CƯNG VÀ NỘI QUY</w:t>
+        <w:t>{{#policiesTable}}</w:t>
+      </w:r>
+    </w:p>
+    <w:p>
+      <w:pPr/>
+      <w:r>
+        <w:rPr>
+          <w:b w:val="0"/>
+          <w:spacing w:val="-6"/>
+        </w:rPr>
+        <w:t>8.2. Quyền nuôi thú cưng, hút thuốc, cho thuê lại, khách qua đêm, thời hạn báo trước/hoàn cọc, thông báo kiểm tra và sửa chữa/cải tạo/lắp đặt thực hiện đúng Bảng chính sách, đọc cùng trách nhiệm bảo vệ tài sản và tuân thủ pháp luật.</w:t>
+      </w:r>
+    </w:p>
+    <w:p>
+      <w:pPr>
+        <w:pStyle w:val="ContractHeading"/>
+      </w:pPr>
+      <w:r>
+        <w:rPr>
+          <w:b w:val="0"/>
+        </w:rPr>
+        <w:t>ĐIỀU 9. CHẤM DỨT HỢP ĐỒNG VÀ GIẢI QUYẾT TRANH CHẤP</w:t>
+      </w:r>
+    </w:p>
+    <w:p>
+      <w:pPr/>
+      <w:r>
+        <w:rPr>
+          <w:b w:val="0"/>
+          <w:spacing w:val="-6"/>
+        </w:rPr>
+        <w:t>9.1. Thời hạn thông báo trước khi chấm dứt và thời hạn hoàn cọc theo Bảng chính sách; hoàn trả nhà và quyết toán số cọc còn phải hoàn bằng chuyển khoản trực tiếp, đọc cùng điều kiện cọc đã chốt.</w:t>
+      </w:r>
+    </w:p>
+    <w:p>
+      <w:pPr/>
+      <w:r>
+        <w:rPr>
+          <w:b w:val="0"/>
+          <w:spacing w:val="-6"/>
+        </w:rPr>
+        <w:t>9.2. Phí chậm thanh toán (nếu áp dụng) theo phương thức và mức đã thỏa thuận, được ghi riêng trên hóa đơn quá hạn. Khi Bên B khai báo đã chuyển khoản, việc cập nhật khoản phí được tạm dừng để đối soát; HomeSpace không tự xác nhận giao dịch ngân hàng.</w:t>
       </w:r>
     </w:p>
     <w:p>
       <w:pPr>
         <w:keepNext w:val="0"/>
-        <w:widowControl/>
-        <w:spacing w:before="0" w:after="80" w:line="276" w:lineRule="auto"/>
-        <w:ind w:left="0" w:firstLine="0"/>
-        <w:jc w:val="both"/>
       </w:pPr>
       <w:r>
         <w:rPr>
-          <w:rFonts w:ascii="Times New Roman" w:hAnsi="Times New Roman" w:eastAsia="Times New Roman"/>
           <w:b w:val="0"/>
-          <w:i w:val="0"/>
-          <w:sz w:val="24"/>
+          <w:spacing w:val="-6"/>
         </w:rPr>
-        <w:t>8.1. Quy định về nuôi thú cưng (nếu được phép theo Bảng tiện ích): Bên B cam kết giữ vệ sinh, đảm bảo an toàn, không gây tiếng ồn ảnh hưởng xung quanh và bồi thường 100% nếu gây thiệt hại.</w:t>
+        <w:t>9.3. Từ 00:00 ngày quá hạn thứ 5 (giờ Việt Nam), HomeSpace mở lựa chọn để Bên A cho chuyển công nợ và phí phạt đã chốt sang hóa đơn kỳ tiếp theo nếu còn kỳ thuê, hoặc đề nghị hai bên chấm dứt sớm; HomeSpace không tự động chấm dứt hợp đồng. Khi chuyển nợ, phí phạt của khoản chuyển dừng tăng và khoản cũ chỉ được cộng một lần.</w:t>
+      </w:r>
+    </w:p>
+    <w:p>
+      <w:pPr>
+        <w:keepNext w:val="0"/>
+      </w:pPr>
+      <w:r>
+        <w:rPr>
+          <w:b w:val="0"/>
+          <w:spacing w:val="-6"/>
+        </w:rPr>
+        <w:t>9.4. Nếu Bên B đồng ý đề nghị chấm dứt, Bên A xác nhận đã thực tế nhận lại nhà, chìa khóa và tài sản rồi mới hoàn tất. Nếu Bên B từ chối, hợp đồng vẫn có hiệu lực, tin đăng chưa mở lại và cọc chưa chuyển chủ; Bên A có thể rút đề nghị hoặc thực hiện nhánh chấm dứt theo điều khoản đã ký, sau khi thông báo và thực tế nhận lại tài sản bàn giao.</w:t>
+      </w:r>
+    </w:p>
+    <w:p>
+      <w:pPr>
+        <w:keepNext w:val="0"/>
+      </w:pPr>
+      <w:r>
+        <w:rPr>
+          <w:b w:val="0"/>
+          <w:spacing w:val="-6"/>
+        </w:rPr>
+        <w:t>9.5. Chỉ sau khi hoàn tất bàn giao, hệ thống mới cập nhật trạng thái hợp đồng, khoản cọc và tin đăng. Công nợ còn thiếu vẫn được theo dõi riêng; việc quyết toán và xử lý tiền cọc căn cứ vào điều kiện đã ký. HomeSpace không nhận giữ tiền, không tự chiếm hữu tài sản hoặc cưỡng chế thu hồi.</w:t>
       </w:r>
     </w:p>
     <w:p>
       <w:pPr>
         <w:keepNext/>
-        <w:widowControl/>
-        <w:spacing w:before="160" w:after="80" w:line="276" w:lineRule="auto"/>
-        <w:ind w:left="0" w:firstLine="0"/>
+      </w:pPr>
+      <w:r>
+        <w:rPr>
+          <w:b w:val="0"/>
+          <w:spacing w:val="-6"/>
+        </w:rPr>
+        <w:t>9.6. Toàn văn điều khoản quá hạn, phí chậm trả và phương án chấm dứt đã được hai bên chốt:</w:t>
+      </w:r>
+    </w:p>
+    <w:p>
+      <w:pPr>
+        <w:pStyle w:val="ContractMarker"/>
+        <w:keepNext w:val="0"/>
+        <w:spacing w:after="80"/>
         <w:jc w:val="left"/>
       </w:pPr>
       <w:r>
         <w:rPr>
-          <w:rFonts w:ascii="Times New Roman" w:hAnsi="Times New Roman" w:eastAsia="Times New Roman"/>
-          <w:b/>
-          <w:i w:val="0"/>
-          <w:sz w:val="26"/>
+          <w:b w:val="0"/>
+          <w:spacing w:val="-6"/>
         </w:rPr>
-        <w:t>ĐIỀU 9. CHẤM DỨT HỢP ĐỒNG VÀ GIẢI QUYẾT TRANH CHẤP</w:t>
+        <w:t>{{contract.specialTerms}}</w:t>
       </w:r>
     </w:p>
     <w:p>
       <w:pPr>
         <w:keepNext w:val="0"/>
-        <w:widowControl/>
-        <w:spacing w:before="0" w:after="80" w:line="276" w:lineRule="auto"/>
-        <w:ind w:left="0" w:firstLine="0"/>
-        <w:jc w:val="both"/>
       </w:pPr>
       <w:r>
         <w:rPr>
-          <w:rFonts w:ascii="Times New Roman" w:hAnsi="Times New Roman" w:eastAsia="Times New Roman"/>
           <w:b w:val="0"/>
-          <w:i w:val="0"/>
-          <w:sz w:val="24"/>
+          <w:spacing w:val="-6"/>
         </w:rPr>
-        <w:t>9.1. Bên muốn chấm dứt hợp đồng thực hiện thông báo trước theo thỏa thuận; Bên B hoàn trả nhà, chìa khóa và tài sản bàn giao; số cọc còn phải hoàn được quyết toán và chuyển khoản trực tiếp theo Hợp đồng.</w:t>
+        <w:t>9.7. Trường hợp bất khả kháng và tranh chấp phát sinh được giải quyết trước hết bằng thương lượng; nếu không đạt được thỏa thuận, các bên có thể yêu cầu Tòa án có thẩm quyền giải quyết.</w:t>
       </w:r>
     </w:p>
     <w:p>
       <w:pPr>
-        <w:keepNext w:val="0"/>
-        <w:widowControl/>
-        <w:spacing w:before="0" w:after="80" w:line="276" w:lineRule="auto"/>
-        <w:ind w:left="0" w:firstLine="0"/>
-        <w:jc w:val="both"/>
+        <w:pStyle w:val="ContractHeading"/>
+        <w:keepNext/>
       </w:pPr>
       <w:r>
         <w:rPr>
-          <w:rFonts w:ascii="Times New Roman" w:hAnsi="Times New Roman" w:eastAsia="Times New Roman"/>
           <w:b w:val="0"/>
-          <w:i w:val="0"/>
-          <w:sz w:val="24"/>
-        </w:rPr>
-        <w:t>9.2. Nếu hóa đơn quá hạn, phí chậm thanh toán (nếu có) chỉ tính theo mức và cách tính đã ghi trong điều khoản được điền; không ghi số cố định khác và được ghi riêng trên hóa đơn quá hạn. Khi Bên B khai báo đã chuyển khoản, việc cập nhật phí của khoản đó tạm dừng để đối soát. Từ 00:00 ngày quá hạn thứ 5 theo giờ Việt Nam, chủ nhà có thể cho chuyển công nợ và phí phạt đã chốt sang kỳ tiếp theo nếu còn kỳ; phí của khoản chuyển dừng tăng và khoản cũ chỉ được cộng một lần, hoặc đề nghị hai bên chấm dứt sớm. Nếu Bên B đồng ý chấm dứt sớm, Bên A xác nhận đã thực tế nhận lại nhà, chìa khóa và tài sản rồi mới hoàn tất. Nếu Bên B từ chối, hợp đồng vẫn hiệu lực; Bên A có thể rút đề nghị hoặc xử lý theo đúng điều khoản đã ký sau khi thông báo và thực tế nhận lại nhà, chìa khóa, tài sản. Chỉ sau khi hoàn tất bàn giao mới mở lại tin đăng hoặc cập nhật trạng thái hợp đồng/cọc. Công nợ chưa thanh toán vẫn được theo dõi riêng; HomeSpace không tự thu tiền, giữ tiền hoặc cưỡng chế thu hồi nhà.</w:t>
-      </w:r>
-    </w:p>
-    <w:p>
-      <w:pPr>
-        <w:keepNext w:val="0"/>
-        <w:widowControl/>
-        <w:spacing w:before="0" w:after="80" w:line="276" w:lineRule="auto"/>
-        <w:ind w:left="0" w:firstLine="0"/>
-        <w:jc w:val="both"/>
-      </w:pPr>
-      <w:r>
-        <w:rPr>
-          <w:rFonts w:ascii="Times New Roman" w:hAnsi="Times New Roman" w:eastAsia="Times New Roman"/>
-          <w:b w:val="0"/>
-          <w:i w:val="0"/>
-          <w:sz w:val="24"/>
-        </w:rPr>
-        <w:t>9.3. Toàn văn điều khoản quá hạn, phí chậm trả và phương án chấm dứt đã được backend chốt: {{contract.specialTerms}}</w:t>
-      </w:r>
-    </w:p>
-    <w:p>
-      <w:pPr>
-        <w:keepNext w:val="0"/>
-        <w:widowControl/>
-        <w:spacing w:before="0" w:after="80" w:line="276" w:lineRule="auto"/>
-        <w:ind w:left="0" w:firstLine="0"/>
-        <w:jc w:val="both"/>
-      </w:pPr>
-      <w:r>
-        <w:rPr>
-          <w:rFonts w:ascii="Times New Roman" w:hAnsi="Times New Roman" w:eastAsia="Times New Roman"/>
-          <w:b w:val="0"/>
-          <w:i w:val="0"/>
-          <w:sz w:val="24"/>
-        </w:rPr>
-        <w:t>9.4. Trường hợp bất khả kháng; tranh chấp được ưu tiên giải quyết thông qua thương lượng, trường hợp không đạt thỏa thuận thì giải quyết tại Tòa án có thẩm quyền.</w:t>
-      </w:r>
-    </w:p>
-    <w:p>
-      <w:pPr>
-        <w:keepNext/>
-        <w:widowControl/>
-        <w:spacing w:before="160" w:after="80" w:line="276" w:lineRule="auto"/>
-        <w:ind w:left="0" w:firstLine="0"/>
-        <w:jc w:val="left"/>
-      </w:pPr>
-      <w:r>
-        <w:rPr>
-          <w:rFonts w:ascii="Times New Roman" w:hAnsi="Times New Roman" w:eastAsia="Times New Roman"/>
-          <w:b/>
-          <w:i w:val="0"/>
-          <w:sz w:val="26"/>
         </w:rPr>
         <w:t>ĐIỀU 10. GIAO KẾT ĐIỆN TỬ VÀ HIỆU LỰC</w:t>
       </w:r>
@@ -1391,17 +1675,11 @@
     <w:p>
       <w:pPr>
         <w:keepNext w:val="0"/>
-        <w:widowControl/>
-        <w:spacing w:before="0" w:after="80" w:line="276" w:lineRule="auto"/>
-        <w:ind w:left="0" w:firstLine="0"/>
-        <w:jc w:val="both"/>
       </w:pPr>
       <w:r>
         <w:rPr>
-          <w:rFonts w:ascii="Times New Roman" w:hAnsi="Times New Roman" w:eastAsia="Times New Roman"/>
           <w:b w:val="0"/>
-          <w:i w:val="0"/>
-          <w:sz w:val="24"/>
+          <w:spacing w:val="-6"/>
         </w:rPr>
         <w:t>10.1. Hợp đồng được giao kết điện tử/xác nhận thông qua nền tảng HomeSpace phù hợp Luật Giao dịch điện tử.</w:t>
       </w:r>
@@ -1409,35 +1687,49 @@
     <w:p>
       <w:pPr>
         <w:keepNext w:val="0"/>
-        <w:widowControl/>
-        <w:spacing w:before="0" w:after="80" w:line="276" w:lineRule="auto"/>
-        <w:ind w:left="0" w:firstLine="0"/>
-        <w:jc w:val="both"/>
       </w:pPr>
       <w:r>
         <w:rPr>
-          <w:rFonts w:ascii="Times New Roman" w:hAnsi="Times New Roman" w:eastAsia="Times New Roman"/>
           <w:b w:val="0"/>
-          <w:i w:val="0"/>
-          <w:sz w:val="24"/>
+          <w:spacing w:val="-6"/>
         </w:rPr>
-        <w:t>10.2. Phiên bản schema: {{contract.schemaVersion}}, Số hiệu bản sửa đổi: {{contract.revisionNumber}}.</w:t>
+        <w:t xml:space="preserve">10.2. Phiên bản schema: </w:t>
+      </w:r>
+      <w:r>
+        <w:rPr>
+          <w:b w:val="0"/>
+          <w:spacing w:val="-6"/>
+        </w:rPr>
+        <w:t>{{contract.schemaVersion}}</w:t>
+      </w:r>
+      <w:r>
+        <w:rPr>
+          <w:b w:val="0"/>
+          <w:spacing w:val="-6"/>
+        </w:rPr>
+        <w:t xml:space="preserve">; Số hiệu bản sửa đổi: </w:t>
+      </w:r>
+      <w:r>
+        <w:rPr>
+          <w:b w:val="0"/>
+          <w:spacing w:val="-6"/>
+        </w:rPr>
+        <w:t>{{contract.revisionNumber}}</w:t>
+      </w:r>
+      <w:r>
+        <w:rPr>
+          <w:b w:val="0"/>
+          <w:spacing w:val="-6"/>
+        </w:rPr>
+        <w:t>.</w:t>
       </w:r>
     </w:p>
     <w:p>
-      <w:pPr>
-        <w:keepNext w:val="0"/>
-        <w:widowControl/>
-        <w:spacing w:before="0" w:after="80" w:line="276" w:lineRule="auto"/>
-        <w:ind w:left="0" w:firstLine="0"/>
-        <w:jc w:val="both"/>
-      </w:pPr>
+      <w:pPr/>
       <w:r>
         <w:rPr>
-          <w:rFonts w:ascii="Times New Roman" w:hAnsi="Times New Roman" w:eastAsia="Times New Roman"/>
           <w:b w:val="0"/>
-          <w:i w:val="0"/>
-          <w:sz w:val="24"/>
+          <w:spacing w:val="-6"/>
         </w:rPr>
         <w:t>10.3. Hợp đồng có hiệu lực kể từ thời điểm hai bên hoàn tất xác nhận/ký điện tử.</w:t>
       </w:r>
@@ -1461,13 +1753,10 @@
       <w:spacing w:after="0"/>
       <w:jc w:val="right"/>
     </w:pPr>
-    <w:r/>
     <w:r>
       <w:rPr>
-        <w:rFonts w:ascii="Times New Roman" w:hAnsi="Times New Roman" w:eastAsia="Times New Roman"/>
-        <w:b w:val="0"/>
-        <w:i w:val="0"/>
-        <w:color w:val="A0A0A0"/>
+        <w:rFonts w:ascii="Times New Roman" w:hAnsi="Times New Roman"/>
+        <w:color w:val="9A9A9A"/>
         <w:sz w:val="17"/>
       </w:rPr>
       <w:t>HomeSpace | Mẫu hợp đồng điện tử | Nhà nguyên căn</w:t>
@@ -1839,8 +2128,14 @@
     <w:name w:val="Normal"/>
     <w:qFormat/>
     <w:rsid w:val="00FC693F"/>
+    <w:pPr>
+      <w:widowControl/>
+      <w:spacing w:after="80" w:before="0" w:line="276" w:lineRule="auto"/>
+      <w:jc w:val="both"/>
+    </w:pPr>
     <w:rPr>
       <w:rFonts w:ascii="Times New Roman" w:hAnsi="Times New Roman" w:eastAsia="Times New Roman"/>
+      <w:color w:val="101010"/>
       <w:sz w:val="24"/>
     </w:rPr>
   </w:style>
@@ -13525,6 +13820,77 @@
         <w:shd w:val="clear" w:color="auto" w:fill="FBCAA2" w:themeFill="accent6" w:themeFillTint="7F"/>
       </w:tcPr>
     </w:tblStylePr>
+  </w:style>
+  <w:style w:type="paragraph" w:customStyle="1" w:styleId="ContractTitle">
+    <w:name w:val="ContractTitle"/>
+    <w:basedOn w:val="Normal"/>
+    <w:pPr>
+      <w:keepNext/>
+      <w:widowControl/>
+      <w:spacing w:before="20" w:after="180"/>
+      <w:jc w:val="center"/>
+    </w:pPr>
+    <w:rPr>
+      <w:rFonts w:ascii="Times New Roman" w:hAnsi="Times New Roman" w:eastAsia="Times New Roman"/>
+      <w:b/>
+      <w:sz w:val="32"/>
+    </w:rPr>
+  </w:style>
+  <w:style w:type="paragraph" w:customStyle="1" w:styleId="ContractHeading">
+    <w:name w:val="ContractHeading"/>
+    <w:basedOn w:val="Normal"/>
+    <w:pPr>
+      <w:keepNext/>
+      <w:widowControl/>
+      <w:spacing w:before="160" w:after="80"/>
+    </w:pPr>
+    <w:rPr>
+      <w:rFonts w:ascii="Times New Roman" w:hAnsi="Times New Roman" w:eastAsia="Times New Roman"/>
+      <w:b/>
+      <w:sz w:val="26"/>
+    </w:rPr>
+  </w:style>
+  <w:style w:type="paragraph" w:customStyle="1" w:styleId="ContractLegalHeading">
+    <w:name w:val="ContractLegalHeading"/>
+    <w:basedOn w:val="Normal"/>
+    <w:pPr>
+      <w:keepNext/>
+      <w:widowControl/>
+      <w:spacing w:before="200" w:after="100"/>
+    </w:pPr>
+    <w:rPr>
+      <w:rFonts w:ascii="Times New Roman" w:hAnsi="Times New Roman" w:eastAsia="Times New Roman"/>
+      <w:b/>
+      <w:sz w:val="26"/>
+    </w:rPr>
+  </w:style>
+  <w:style w:type="paragraph" w:customStyle="1" w:styleId="ContractSubheading">
+    <w:name w:val="ContractSubheading"/>
+    <w:basedOn w:val="Normal"/>
+    <w:pPr>
+      <w:keepNext/>
+      <w:widowControl/>
+      <w:spacing w:before="100" w:after="80"/>
+    </w:pPr>
+    <w:rPr>
+      <w:rFonts w:ascii="Times New Roman" w:hAnsi="Times New Roman" w:eastAsia="Times New Roman"/>
+      <w:b/>
+      <w:sz w:val="24"/>
+    </w:rPr>
+  </w:style>
+  <w:style w:type="paragraph" w:customStyle="1" w:styleId="ContractMarker">
+    <w:name w:val="ContractMarker"/>
+    <w:basedOn w:val="Normal"/>
+    <w:pPr>
+      <w:keepNext w:val="0"/>
+      <w:widowControl/>
+      <w:spacing w:before="20" w:after="140"/>
+    </w:pPr>
+    <w:rPr>
+      <w:rFonts w:ascii="Times New Roman" w:hAnsi="Times New Roman" w:eastAsia="Times New Roman"/>
+      <w:b w:val="0"/>
+      <w:sz w:val="24"/>
+    </w:rPr>
   </w:style>
 </w:styles>
 </file>

</xml_diff>